<commit_message>
Consolida tarefas multimodais: substitui as 12 tarefas anteriores por 7 tarefas mescladas por tema
</commit_message>
<xml_diff>
--- a/Material_de_Apoio_Pratica_Perguntas/Tarefas_Multimodais_Pensamento_Computacional.docx
+++ b/Material_de_Apoio_Pratica_Perguntas/Tarefas_Multimodais_Pensamento_Computacional.docx
@@ -45,7 +45,7 @@
           <w:sz w:val="26"/>
           <w:szCs w:val="26"/>
         </w:rPr>
-        <w:t xml:space="preserve">Julia + Pluto, Scratch e material concreto — uma tarefa por pilar do pensamento computacional (Aulas 2 a 8)</w:t>
+        <w:t xml:space="preserve">Julia + Pluto, Scratch e material concreto — cobrindo os 12 temas centrais do curso, agrupados em 7 tarefas</w:t>
       </w:r>
     </w:p>
     <w:p>
@@ -68,75 +68,12 @@
           <w:sz w:val="22"/>
           <w:szCs w:val="22"/>
         </w:rPr>
-        <w:t xml:space="preserve">Este material propõe uma tarefa nova para cada um dos sete blocos centrais do curso — Indução, Dedução, Problemas e Algoritmos, Representação, Decomposição, Generalização e Transformação — desenhada para ser feita de três formas diferentes, conforme os recursos disponíveis em sala:</w:t>
-      </w:r>
-    </w:p>
-    <w:p>
-      <w:pPr>
-        <w:pStyle w:val="ListParagraph"/>
-        <w:numPr>
-          <w:ilvl w:val="0"/>
-          <w:numId w:val="2"/>
-        </w:numPr>
-        <w:spacing w:after="80"/>
-      </w:pPr>
-      <w:r>
-        <w:rPr>
-          <w:sz w:val="22"/>
-          <w:szCs w:val="22"/>
-        </w:rPr>
-        <w:t xml:space="preserve">Julia + Pluto — a mesma linguagem e ambiente já usados no restante do curso, para turmas com acesso a computadores.</w:t>
-      </w:r>
-    </w:p>
-    <w:p>
-      <w:pPr>
-        <w:pStyle w:val="ListParagraph"/>
-        <w:numPr>
-          <w:ilvl w:val="0"/>
-          <w:numId w:val="2"/>
-        </w:numPr>
-        <w:spacing w:after="80"/>
-      </w:pPr>
-      <w:r>
-        <w:rPr>
-          <w:sz w:val="22"/>
-          <w:szCs w:val="22"/>
-        </w:rPr>
-        <w:t xml:space="preserve">Scratch — versão em blocos visuais, para turmas mais jovens ou sem experiência prévia com código em texto.</w:t>
-      </w:r>
-    </w:p>
-    <w:p>
-      <w:pPr>
-        <w:pStyle w:val="ListParagraph"/>
-        <w:numPr>
-          <w:ilvl w:val="0"/>
-          <w:numId w:val="2"/>
-        </w:numPr>
-        <w:spacing w:after="80"/>
-      </w:pPr>
-      <w:r>
-        <w:rPr>
-          <w:sz w:val="22"/>
-          <w:szCs w:val="22"/>
-        </w:rPr>
-        <w:t xml:space="preserve">Material concreto — atividade desplugada, com cartões, fichas ou objetos manipuláveis, para turmas sem acesso a computadores ou como complemento antes da versão digital.</w:t>
-      </w:r>
-    </w:p>
-    <w:p>
-      <w:pPr>
-        <w:spacing w:after="120"/>
-      </w:pPr>
-      <w:r>
-        <w:rPr>
-          <w:sz w:val="22"/>
-          <w:szCs w:val="22"/>
-        </w:rPr>
-        <w:t xml:space="preserve">As três versões de cada tarefa trabalham o mesmo conceito e terminam com o mesmo critério qualitativo já usado no restante do curso — o professor pode escolher uma versão, ou aplicar as três em sequência (concreto → Scratch → Julia) para aprofundar a compreensão antes de formalizar em código.</w:t>
-      </w:r>
-    </w:p>
-    <w:p>
-      <w:pPr>
-        <w:spacing w:after="40" w:before="480"/>
+        <w:t xml:space="preserve">Esta versão substitui os dois conjuntos anteriores (7 tarefas dos blocos 2-8 + 5 tarefas do módulo complementar) por um único conjunto de 7 tarefas, agrupando temas relacionados: Indução+Dedução; Problemas e Algoritmos; Representação+Arrays; Decomposição+Generalização+Transformação; Abstração e Especialização; Definindo Tipos+Ações por Categoria; e Complexidade de Algoritmos. Cada tarefa continua em três versões — Julia + Pluto, Scratch e material concreto — com o mesmo critério qualitativo do restante do curso.</w:t>
+      </w:r>
+    </w:p>
+    <w:p>
+      <w:pPr>
+        <w:spacing w:after="40" w:before="0"/>
       </w:pPr>
       <w:r>
         <w:rPr>
@@ -163,7 +100,7 @@
           <w:sz w:val="34"/>
           <w:szCs w:val="34"/>
         </w:rPr>
-        <w:t xml:space="preserve">Indução — hipóteses a partir de padrões</w:t>
+        <w:t xml:space="preserve">Indução e Dedução — da hipótese à regra aplicada</w:t>
       </w:r>
     </w:p>
     <w:p>
@@ -178,7 +115,7 @@
           <w:sz w:val="20"/>
           <w:szCs w:val="20"/>
         </w:rPr>
-        <w:t xml:space="preserve">Aula 2 · Pensamento Indutivo · Pensamento Computacional</w:t>
+        <w:t xml:space="preserve">Aula 2-3 · Pensamento Indutivo e Dedutivo · Pensamento Computacional</w:t>
       </w:r>
     </w:p>
     <w:p>
@@ -210,7 +147,7 @@
           <w:sz w:val="22"/>
           <w:szCs w:val="22"/>
         </w:rPr>
-        <w:t xml:space="preserve">Formular uma hipótese (regra geral) a partir de casos observados numa sequência, e testá-la com novos casos e com um contraexemplo — o mesmo raciocínio indutivo trabalhado na Aula 2, agora em três formas de fazer.</w:t>
+        <w:t xml:space="preserve">Formular uma hipótese a partir de casos observados (indução) e, em seguida, aplicar uma regra geral já definida a casos específicos (dedução) — os dois raciocínios que se completam, trabalhados nas Aulas 2 e 3.</w:t>
       </w:r>
     </w:p>
     <w:p>
@@ -242,7 +179,7 @@
           <w:sz w:val="22"/>
           <w:szCs w:val="22"/>
         </w:rPr>
-        <w:t xml:space="preserve">Observem a sequência abaixo e proponham uma função que gere o próximo termo.</w:t>
+        <w:t xml:space="preserve">Parte 1 — Indução: observem a sequência e proponham uma regra para o próximo termo.</w:t>
       </w:r>
     </w:p>
     <w:tbl>
@@ -296,6 +233,20 @@
                 <w:sz w:val="20"/>
                 <w:szCs w:val="20"/>
               </w:rPr>
+              <w:t xml:space="preserve">proximo_termo(seq) = seq[end] + 3   # hipótese: soma 3 ao anterior</w:t>
+            </w:r>
+          </w:p>
+          <w:p>
+            <w:pPr>
+              <w:spacing w:after="0"/>
+            </w:pPr>
+            <w:r>
+              <w:rPr>
+                <w:rFonts w:ascii="Courier New" w:cs="Courier New" w:eastAsia="Courier New" w:hAnsi="Courier New"/>
+                <w:color w:val="20303F"/>
+                <w:sz w:val="20"/>
+                <w:szCs w:val="20"/>
+              </w:rPr>
               <w:t xml:space="preserve"> </w:t>
             </w:r>
           </w:p>
@@ -310,49 +261,49 @@
                 <w:sz w:val="20"/>
                 <w:szCs w:val="20"/>
               </w:rPr>
-              <w:t xml:space="preserve"># hipótese: cada termo soma 3 ao anterior</w:t>
-            </w:r>
-          </w:p>
-          <w:p>
-            <w:pPr>
-              <w:spacing w:after="0"/>
-            </w:pPr>
-            <w:r>
-              <w:rPr>
-                <w:rFonts w:ascii="Courier New" w:cs="Courier New" w:eastAsia="Courier New" w:hAnsi="Courier New"/>
-                <w:color w:val="20303F"/>
-                <w:sz w:val="20"/>
-                <w:szCs w:val="20"/>
-              </w:rPr>
-              <w:t xml:space="preserve">proximo_termo(seq) = seq[end] + 3</w:t>
-            </w:r>
-          </w:p>
-          <w:p>
-            <w:pPr>
-              <w:spacing w:after="0"/>
-            </w:pPr>
-            <w:r>
-              <w:rPr>
-                <w:rFonts w:ascii="Courier New" w:cs="Courier New" w:eastAsia="Courier New" w:hAnsi="Courier New"/>
-                <w:color w:val="20303F"/>
-                <w:sz w:val="20"/>
-                <w:szCs w:val="20"/>
-              </w:rPr>
-              <w:t xml:space="preserve"> </w:t>
-            </w:r>
-          </w:p>
-          <w:p>
-            <w:pPr>
-              <w:spacing w:after="0"/>
-            </w:pPr>
-            <w:r>
-              <w:rPr>
-                <w:rFonts w:ascii="Courier New" w:cs="Courier New" w:eastAsia="Courier New" w:hAnsi="Courier New"/>
-                <w:color w:val="20303F"/>
-                <w:sz w:val="20"/>
-                <w:szCs w:val="20"/>
-              </w:rPr>
-              <w:t xml:space="preserve">sequencia_teste = [sequencia; proximo_termo(sequencia)]</w:t>
+              <w:t xml:space="preserve"># Parte 2 — Dedução: apliquem uma regra geral já definida a casos específicos</w:t>
+            </w:r>
+          </w:p>
+          <w:p>
+            <w:pPr>
+              <w:spacing w:after="0"/>
+            </w:pPr>
+            <w:r>
+              <w:rPr>
+                <w:rFonts w:ascii="Courier New" w:cs="Courier New" w:eastAsia="Courier New" w:hAnsi="Courier New"/>
+                <w:color w:val="20303F"/>
+                <w:sz w:val="20"/>
+                <w:szCs w:val="20"/>
+              </w:rPr>
+              <w:t xml:space="preserve">multiplo_de_3(n) = n % 3 == 0 ? "múltiplo de 3" : "não é múltiplo de 3"</w:t>
+            </w:r>
+          </w:p>
+          <w:p>
+            <w:pPr>
+              <w:spacing w:after="0"/>
+            </w:pPr>
+            <w:r>
+              <w:rPr>
+                <w:rFonts w:ascii="Courier New" w:cs="Courier New" w:eastAsia="Courier New" w:hAnsi="Courier New"/>
+                <w:color w:val="20303F"/>
+                <w:sz w:val="20"/>
+                <w:szCs w:val="20"/>
+              </w:rPr>
+              <w:t xml:space="preserve">casos = [9, 10, 15, 20]</w:t>
+            </w:r>
+          </w:p>
+          <w:p>
+            <w:pPr>
+              <w:spacing w:after="0"/>
+            </w:pPr>
+            <w:r>
+              <w:rPr>
+                <w:rFonts w:ascii="Courier New" w:cs="Courier New" w:eastAsia="Courier New" w:hAnsi="Courier New"/>
+                <w:color w:val="20303F"/>
+                <w:sz w:val="20"/>
+                <w:szCs w:val="20"/>
+              </w:rPr>
+              <w:t xml:space="preserve">resultados = multiplo_de_3.(casos)</w:t>
             </w:r>
           </w:p>
         </w:tc>
@@ -369,7 +320,7 @@
           <w:sz w:val="22"/>
           <w:szCs w:val="22"/>
         </w:rPr>
-        <w:t xml:space="preserve">Testem a hipótese com pelo menos 3 novos termos e proponham um contraexemplo (uma sequência que pareça seguir a regra, mas que a quebre) — depois revisem a hipótese.</w:t>
+        <w:t xml:space="preserve">Na Parte 1, testem a hipótese com novos termos e um contraexemplo. Na Parte 2, apliquem a regra a pelo menos 4 casos, incluindo um caso-limite (um múltiplo exato de 3), e discutam a diferença entre propor uma regra (indução) e aplicá-la (dedução).</w:t>
       </w:r>
     </w:p>
     <w:p>
@@ -406,75 +357,41 @@
           <w:sz w:val="22"/>
           <w:szCs w:val="22"/>
         </w:rPr>
-        <w:t xml:space="preserve">Criem uma lista chamada "sequência" e adicionem os valores 3, 6, 9, 12.</w:t>
-      </w:r>
-    </w:p>
-    <w:p>
-      <w:pPr>
-        <w:pStyle w:val="ListParagraph"/>
-        <w:numPr>
-          <w:ilvl w:val="0"/>
-          <w:numId w:val="2"/>
-        </w:numPr>
-        <w:spacing w:after="80"/>
-      </w:pPr>
-      <w:r>
-        <w:rPr>
-          <w:sz w:val="22"/>
-          <w:szCs w:val="22"/>
-        </w:rPr>
-        <w:t xml:space="preserve">Usem o bloco "pergunte e espere" para o(a) colega da dupla digitar a regra que imagina.</w:t>
-      </w:r>
-    </w:p>
-    <w:p>
-      <w:pPr>
-        <w:pStyle w:val="ListParagraph"/>
-        <w:numPr>
-          <w:ilvl w:val="0"/>
-          <w:numId w:val="2"/>
-        </w:numPr>
-        <w:spacing w:after="80"/>
-      </w:pPr>
-      <w:r>
-        <w:rPr>
-          <w:sz w:val="22"/>
-          <w:szCs w:val="22"/>
-        </w:rPr>
-        <w:t xml:space="preserve">Criem um bloco personalizado "gerar próximo termo" que soma 3 ao último valor da lista.</w:t>
-      </w:r>
-    </w:p>
-    <w:p>
-      <w:pPr>
-        <w:pStyle w:val="ListParagraph"/>
-        <w:numPr>
-          <w:ilvl w:val="0"/>
-          <w:numId w:val="2"/>
-        </w:numPr>
-        <w:spacing w:after="80"/>
-      </w:pPr>
-      <w:r>
-        <w:rPr>
-          <w:sz w:val="22"/>
-          <w:szCs w:val="22"/>
-        </w:rPr>
-        <w:t xml:space="preserve">Comparem a resposta digitada com o valor gerado pelo bloco, usando "se ... então" e o bloco "diga" para mostrar "certo" ou "tente de novo".</w:t>
-      </w:r>
-    </w:p>
-    <w:p>
-      <w:pPr>
-        <w:pStyle w:val="ListParagraph"/>
-        <w:numPr>
-          <w:ilvl w:val="0"/>
-          <w:numId w:val="2"/>
-        </w:numPr>
-        <w:spacing w:after="80"/>
-      </w:pPr>
-      <w:r>
-        <w:rPr>
-          <w:sz w:val="22"/>
-          <w:szCs w:val="22"/>
-        </w:rPr>
-        <w:t xml:space="preserve">Desafio extra: troquem a lista por uma sequência não linear (2, 4, 8, 16) e peçam que ajustem a regra.</w:t>
+        <w:t xml:space="preserve">Parte indução: criem a lista "sequência" (3, 6, 9, 12), peçam a regra com "pergunte e espere" e testem com um bloco personalizado.</w:t>
+      </w:r>
+    </w:p>
+    <w:p>
+      <w:pPr>
+        <w:pStyle w:val="ListParagraph"/>
+        <w:numPr>
+          <w:ilvl w:val="0"/>
+          <w:numId w:val="2"/>
+        </w:numPr>
+        <w:spacing w:after="80"/>
+      </w:pPr>
+      <w:r>
+        <w:rPr>
+          <w:sz w:val="22"/>
+          <w:szCs w:val="22"/>
+        </w:rPr>
+        <w:t xml:space="preserve">Parte dedução: criem um bloco "é múltiplo de 3?" usando "se ... então ... senão" com o operador de resto da divisão, e apliquem a uma lista de números.</w:t>
+      </w:r>
+    </w:p>
+    <w:p>
+      <w:pPr>
+        <w:pStyle w:val="ListParagraph"/>
+        <w:numPr>
+          <w:ilvl w:val="0"/>
+          <w:numId w:val="2"/>
+        </w:numPr>
+        <w:spacing w:after="80"/>
+      </w:pPr>
+      <w:r>
+        <w:rPr>
+          <w:sz w:val="22"/>
+          <w:szCs w:val="22"/>
+        </w:rPr>
+        <w:t xml:space="preserve">Comparem as duas partes: numa, a turma descobre a regra; na outra, a regra já existe e só precisa ser aplicada.</w:t>
       </w:r>
     </w:p>
     <w:p>
@@ -511,58 +428,41 @@
           <w:sz w:val="22"/>
           <w:szCs w:val="22"/>
         </w:rPr>
-        <w:t xml:space="preserve">Preparem cartões com quantidades de bolinhas em sequência (1, 2, 3, depois 4, 6, 8).</w:t>
-      </w:r>
-    </w:p>
-    <w:p>
-      <w:pPr>
-        <w:pStyle w:val="ListParagraph"/>
-        <w:numPr>
-          <w:ilvl w:val="0"/>
-          <w:numId w:val="2"/>
-        </w:numPr>
-        <w:spacing w:after="80"/>
-      </w:pPr>
-      <w:r>
-        <w:rPr>
-          <w:sz w:val="22"/>
-          <w:szCs w:val="22"/>
-        </w:rPr>
-        <w:t xml:space="preserve">Em duplas, os alunos escrevem em um cartão em branco qual seria o próximo item da sequência e por quê.</w:t>
-      </w:r>
-    </w:p>
-    <w:p>
-      <w:pPr>
-        <w:pStyle w:val="ListParagraph"/>
-        <w:numPr>
-          <w:ilvl w:val="0"/>
-          <w:numId w:val="2"/>
-        </w:numPr>
-        <w:spacing w:after="80"/>
-      </w:pPr>
-      <w:r>
-        <w:rPr>
-          <w:sz w:val="22"/>
-          <w:szCs w:val="22"/>
-        </w:rPr>
-        <w:t xml:space="preserve">O professor revela um "cartão-armadilha" (contraexemplo) que quebra a regra proposta pela maioria.</w:t>
-      </w:r>
-    </w:p>
-    <w:p>
-      <w:pPr>
-        <w:pStyle w:val="ListParagraph"/>
-        <w:numPr>
-          <w:ilvl w:val="0"/>
-          <w:numId w:val="2"/>
-        </w:numPr>
-        <w:spacing w:after="80"/>
-      </w:pPr>
-      <w:r>
-        <w:rPr>
-          <w:sz w:val="22"/>
-          <w:szCs w:val="22"/>
-        </w:rPr>
-        <w:t xml:space="preserve">A turma discute em roda por que a hipótese falhou e como reformulá-la a partir do novo caso.</w:t>
+        <w:t xml:space="preserve">Parte indução: cartões com sequência de bolinhas (1,2,3, depois 4,6,8) e um "cartão-armadilha" (contraexemplo).</w:t>
+      </w:r>
+    </w:p>
+    <w:p>
+      <w:pPr>
+        <w:pStyle w:val="ListParagraph"/>
+        <w:numPr>
+          <w:ilvl w:val="0"/>
+          <w:numId w:val="2"/>
+        </w:numPr>
+        <w:spacing w:after="80"/>
+      </w:pPr>
+      <w:r>
+        <w:rPr>
+          <w:sz w:val="22"/>
+          <w:szCs w:val="22"/>
+        </w:rPr>
+        <w:t xml:space="preserve">Parte dedução: fluxograma em cartolina ("é múltiplo de 3?") aplicado a fichas de números diferentes, incluindo um múltiplo exato.</w:t>
+      </w:r>
+    </w:p>
+    <w:p>
+      <w:pPr>
+        <w:pStyle w:val="ListParagraph"/>
+        <w:numPr>
+          <w:ilvl w:val="0"/>
+          <w:numId w:val="2"/>
+        </w:numPr>
+        <w:spacing w:after="80"/>
+      </w:pPr>
+      <w:r>
+        <w:rPr>
+          <w:sz w:val="22"/>
+          <w:szCs w:val="22"/>
+        </w:rPr>
+        <w:t xml:space="preserve">Discutam em roda: em qual das duas partes a turma teve que criar a regra, e em qual só seguiu uma regra já pronta?</w:t>
       </w:r>
     </w:p>
     <w:p>
@@ -594,7 +494,7 @@
           <w:sz w:val="20"/>
           <w:szCs w:val="20"/>
         </w:rPr>
-        <w:t xml:space="preserve">investigação e revisão de hipóteses.</w:t>
+        <w:t xml:space="preserve">investigação e revisão de hipóteses (indução) e aplicação de regras gerais a casos específicos (dedução).</w:t>
       </w:r>
     </w:p>
     <w:p>
@@ -627,7 +527,7 @@
           <w:sz w:val="34"/>
           <w:szCs w:val="34"/>
         </w:rPr>
-        <w:t xml:space="preserve">Dedução — aplicar uma regra geral a casos específicos</w:t>
+        <w:t xml:space="preserve">Problemas e Algoritmos — entrada, processamento e saída</w:t>
       </w:r>
     </w:p>
     <w:p>
@@ -642,7 +542,7 @@
           <w:sz w:val="20"/>
           <w:szCs w:val="20"/>
         </w:rPr>
-        <w:t xml:space="preserve">Aula 3 · Pensamento Dedutivo · Pensamento Computacional</w:t>
+        <w:t xml:space="preserve">Aula 4 · Problemas e Algoritmos · Pensamento Computacional</w:t>
       </w:r>
     </w:p>
     <w:p>
@@ -674,7 +574,7 @@
           <w:sz w:val="22"/>
           <w:szCs w:val="22"/>
         </w:rPr>
-        <w:t xml:space="preserve">Representar uma implicação lógica ("se A então B") e aplicá-la a casos específicos, incluindo um caso-limite — complementando a Aula 3, que já trabalha condições (if/elseif/else) como forma de dedução.</w:t>
+        <w:t xml:space="preserve">Separar e identificar as três fases de um algoritmo (entrada, processamento, saída) num problema com decisão — cálculo de média com situação de aprovação — testando casos diversos e um caso-limite, como praticado na Aula 4.</w:t>
       </w:r>
     </w:p>
     <w:p>
@@ -706,7 +606,7 @@
           <w:sz w:val="22"/>
           <w:szCs w:val="22"/>
         </w:rPr>
-        <w:t xml:space="preserve">Escrevam uma função que aplique uma regra geral de liberação (ex.: idade mínima para dirigir).</w:t>
+        <w:t xml:space="preserve">Separem claramente as três fases no código: dados de entrada, cálculo e resultado de saída.</w:t>
       </w:r>
     </w:p>
     <w:tbl>
@@ -746,49 +646,35 @@
                 <w:sz w:val="20"/>
                 <w:szCs w:val="20"/>
               </w:rPr>
-              <w:t xml:space="preserve">regra_dirigir(idade) = idade &gt;= 18 ? "pode dirigir" : "não pode dirigir"</w:t>
-            </w:r>
-          </w:p>
-          <w:p>
-            <w:pPr>
-              <w:spacing w:after="0"/>
-            </w:pPr>
-            <w:r>
-              <w:rPr>
-                <w:rFonts w:ascii="Courier New" w:cs="Courier New" w:eastAsia="Courier New" w:hAnsi="Courier New"/>
-                <w:color w:val="20303F"/>
-                <w:sz w:val="20"/>
-                <w:szCs w:val="20"/>
-              </w:rPr>
-              <w:t xml:space="preserve"> </w:t>
-            </w:r>
-          </w:p>
-          <w:p>
-            <w:pPr>
-              <w:spacing w:after="0"/>
-            </w:pPr>
-            <w:r>
-              <w:rPr>
-                <w:rFonts w:ascii="Courier New" w:cs="Courier New" w:eastAsia="Courier New" w:hAnsi="Courier New"/>
-                <w:color w:val="20303F"/>
-                <w:sz w:val="20"/>
-                <w:szCs w:val="20"/>
-              </w:rPr>
-              <w:t xml:space="preserve">casos = [15, 17, 18, 25]</w:t>
-            </w:r>
-          </w:p>
-          <w:p>
-            <w:pPr>
-              <w:spacing w:after="0"/>
-            </w:pPr>
-            <w:r>
-              <w:rPr>
-                <w:rFonts w:ascii="Courier New" w:cs="Courier New" w:eastAsia="Courier New" w:hAnsi="Courier New"/>
-                <w:color w:val="20303F"/>
-                <w:sz w:val="20"/>
-                <w:szCs w:val="20"/>
-              </w:rPr>
-              <w:t xml:space="preserve">resultados = regra_dirigir.(casos)</w:t>
+              <w:t xml:space="preserve">notas = [7.5, 6.0, 8.2]           # entrada</w:t>
+            </w:r>
+          </w:p>
+          <w:p>
+            <w:pPr>
+              <w:spacing w:after="0"/>
+            </w:pPr>
+            <w:r>
+              <w:rPr>
+                <w:rFonts w:ascii="Courier New" w:cs="Courier New" w:eastAsia="Courier New" w:hAnsi="Courier New"/>
+                <w:color w:val="20303F"/>
+                <w:sz w:val="20"/>
+                <w:szCs w:val="20"/>
+              </w:rPr>
+              <w:t xml:space="preserve">media = sum(notas) / length(notas) # processamento</w:t>
+            </w:r>
+          </w:p>
+          <w:p>
+            <w:pPr>
+              <w:spacing w:after="0"/>
+            </w:pPr>
+            <w:r>
+              <w:rPr>
+                <w:rFonts w:ascii="Courier New" w:cs="Courier New" w:eastAsia="Courier New" w:hAnsi="Courier New"/>
+                <w:color w:val="20303F"/>
+                <w:sz w:val="20"/>
+                <w:szCs w:val="20"/>
+              </w:rPr>
+              <w:t xml:space="preserve">situacao = media &gt;= 6.0 ? "aprovado" : "em recuperação"  # saída</w:t>
             </w:r>
           </w:p>
         </w:tc>
@@ -805,7 +691,7 @@
           <w:sz w:val="22"/>
           <w:szCs w:val="22"/>
         </w:rPr>
-        <w:t xml:space="preserve">Testem com pelo menos 4 casos, incluindo o caso-limite (exatamente 18 anos), e discutam se a fronteira da regra faz sentido.</w:t>
+        <w:t xml:space="preserve">Testem com pelo menos 3 conjuntos de notas diferentes, incluindo um caso-limite (média exatamente 6.0), e apontem no código onde está cada uma das três fases.</w:t>
       </w:r>
     </w:p>
     <w:p>
@@ -842,58 +728,58 @@
           <w:sz w:val="22"/>
           <w:szCs w:val="22"/>
         </w:rPr>
-        <w:t xml:space="preserve">Criem uma variável "idade".</w:t>
-      </w:r>
-    </w:p>
-    <w:p>
-      <w:pPr>
-        <w:pStyle w:val="ListParagraph"/>
-        <w:numPr>
-          <w:ilvl w:val="0"/>
-          <w:numId w:val="2"/>
-        </w:numPr>
-        <w:spacing w:after="80"/>
-      </w:pPr>
-      <w:r>
-        <w:rPr>
-          <w:sz w:val="22"/>
-          <w:szCs w:val="22"/>
-        </w:rPr>
-        <w:t xml:space="preserve">Usem o bloco "se ... então ... senão" para decidir a mensagem ("pode dirigir" / "não pode dirigir").</w:t>
-      </w:r>
-    </w:p>
-    <w:p>
-      <w:pPr>
-        <w:pStyle w:val="ListParagraph"/>
-        <w:numPr>
-          <w:ilvl w:val="0"/>
-          <w:numId w:val="2"/>
-        </w:numPr>
-        <w:spacing w:after="80"/>
-      </w:pPr>
-      <w:r>
-        <w:rPr>
-          <w:sz w:val="22"/>
-          <w:szCs w:val="22"/>
-        </w:rPr>
-        <w:t xml:space="preserve">Testem com o bloco "pergunte e espere", pedindo a idade, e mostrem o resultado com "diga".</w:t>
-      </w:r>
-    </w:p>
-    <w:p>
-      <w:pPr>
-        <w:pStyle w:val="ListParagraph"/>
-        <w:numPr>
-          <w:ilvl w:val="0"/>
-          <w:numId w:val="2"/>
-        </w:numPr>
-        <w:spacing w:after="80"/>
-      </w:pPr>
-      <w:r>
-        <w:rPr>
-          <w:sz w:val="22"/>
-          <w:szCs w:val="22"/>
-        </w:rPr>
-        <w:t xml:space="preserve">Acrescentem um segundo teste específico para o caso-limite (exatamente 18 anos) e confirmem que o resultado é o esperado.</w:t>
+        <w:t xml:space="preserve">Usem 3 blocos "pergunte e espere" para pedir 3 notas.</w:t>
+      </w:r>
+    </w:p>
+    <w:p>
+      <w:pPr>
+        <w:pStyle w:val="ListParagraph"/>
+        <w:numPr>
+          <w:ilvl w:val="0"/>
+          <w:numId w:val="2"/>
+        </w:numPr>
+        <w:spacing w:after="80"/>
+      </w:pPr>
+      <w:r>
+        <w:rPr>
+          <w:sz w:val="22"/>
+          <w:szCs w:val="22"/>
+        </w:rPr>
+        <w:t xml:space="preserve">Calculem "soma" e "média" com variáveis e blocos de operadores.</w:t>
+      </w:r>
+    </w:p>
+    <w:p>
+      <w:pPr>
+        <w:pStyle w:val="ListParagraph"/>
+        <w:numPr>
+          <w:ilvl w:val="0"/>
+          <w:numId w:val="2"/>
+        </w:numPr>
+        <w:spacing w:after="80"/>
+      </w:pPr>
+      <w:r>
+        <w:rPr>
+          <w:sz w:val="22"/>
+          <w:szCs w:val="22"/>
+        </w:rPr>
+        <w:t xml:space="preserve">Usem "se ... então ... senão" para decidir "aprovado" / "em recuperação", mostrando o resultado com "diga".</w:t>
+      </w:r>
+    </w:p>
+    <w:p>
+      <w:pPr>
+        <w:pStyle w:val="ListParagraph"/>
+        <w:numPr>
+          <w:ilvl w:val="0"/>
+          <w:numId w:val="2"/>
+        </w:numPr>
+        <w:spacing w:after="80"/>
+      </w:pPr>
+      <w:r>
+        <w:rPr>
+          <w:sz w:val="22"/>
+          <w:szCs w:val="22"/>
+        </w:rPr>
+        <w:t xml:space="preserve">Marquem com comentários ou post-its ao lado do script qual bloco representa entrada, qual representa processamento e qual representa saída.</w:t>
       </w:r>
     </w:p>
     <w:p>
@@ -930,58 +816,41 @@
           <w:sz w:val="22"/>
           <w:szCs w:val="22"/>
         </w:rPr>
-        <w:t xml:space="preserve">Desenhem um fluxograma em cartolina com um losango de decisão ("idade ≥ 18?") e dois caminhos: SIM e NÃO.</w:t>
-      </w:r>
-    </w:p>
-    <w:p>
-      <w:pPr>
-        <w:pStyle w:val="ListParagraph"/>
-        <w:numPr>
-          <w:ilvl w:val="0"/>
-          <w:numId w:val="2"/>
-        </w:numPr>
-        <w:spacing w:after="80"/>
-      </w:pPr>
-      <w:r>
-        <w:rPr>
-          <w:sz w:val="22"/>
-          <w:szCs w:val="22"/>
-        </w:rPr>
-        <w:t xml:space="preserve">Preparem fichas de personagens com idades diferentes (15, 17, 18, 25, 40).</w:t>
-      </w:r>
-    </w:p>
-    <w:p>
-      <w:pPr>
-        <w:pStyle w:val="ListParagraph"/>
-        <w:numPr>
-          <w:ilvl w:val="0"/>
-          <w:numId w:val="2"/>
-        </w:numPr>
-        <w:spacing w:after="80"/>
-      </w:pPr>
-      <w:r>
-        <w:rPr>
-          <w:sz w:val="22"/>
-          <w:szCs w:val="22"/>
-        </w:rPr>
-        <w:t xml:space="preserve">Em grupo, os alunos seguem cada ficha pelo fluxograma até uma casa de chegada (pode dirigir / não pode).</w:t>
-      </w:r>
-    </w:p>
-    <w:p>
-      <w:pPr>
-        <w:pStyle w:val="ListParagraph"/>
-        <w:numPr>
-          <w:ilvl w:val="0"/>
-          <w:numId w:val="2"/>
-        </w:numPr>
-        <w:spacing w:after="80"/>
-      </w:pPr>
-      <w:r>
-        <w:rPr>
-          <w:sz w:val="22"/>
-          <w:szCs w:val="22"/>
-        </w:rPr>
-        <w:t xml:space="preserve">Discutam: o que aconteceria com todas as fichas se a regra mudasse para 16 anos? Quais mudariam de casa de chegada?</w:t>
+        <w:t xml:space="preserve">Montem um "algoritmo humano": uma pessoa representa a entrada (segura fichas com as notas), outra representa o processamento (faz a conta numa lousa) e uma terceira representa a saída (anuncia o resultado).</w:t>
+      </w:r>
+    </w:p>
+    <w:p>
+      <w:pPr>
+        <w:pStyle w:val="ListParagraph"/>
+        <w:numPr>
+          <w:ilvl w:val="0"/>
+          <w:numId w:val="2"/>
+        </w:numPr>
+        <w:spacing w:after="80"/>
+      </w:pPr>
+      <w:r>
+        <w:rPr>
+          <w:sz w:val="22"/>
+          <w:szCs w:val="22"/>
+        </w:rPr>
+        <w:t xml:space="preserve">Testem com 3 conjuntos de notas diferentes, escritos em fichas, passando-as fisicamente entre as três estações.</w:t>
+      </w:r>
+    </w:p>
+    <w:p>
+      <w:pPr>
+        <w:pStyle w:val="ListParagraph"/>
+        <w:numPr>
+          <w:ilvl w:val="0"/>
+          <w:numId w:val="2"/>
+        </w:numPr>
+        <w:spacing w:after="80"/>
+      </w:pPr>
+      <w:r>
+        <w:rPr>
+          <w:sz w:val="22"/>
+          <w:szCs w:val="22"/>
+        </w:rPr>
+        <w:t xml:space="preserve">O professor entrega um conjunto de notas com um valor inválido (ex.: uma nota "25") e o grupo discute em qual estação esse erro deveria ser detectado.</w:t>
       </w:r>
     </w:p>
     <w:p>
@@ -1013,7 +882,7 @@
           <w:sz w:val="20"/>
           <w:szCs w:val="20"/>
         </w:rPr>
-        <w:t xml:space="preserve">aplicação de regras e articulação entre indução e dedução.</w:t>
+        <w:t xml:space="preserve">decomposição do algoritmo em fases e teste/depuração.</w:t>
       </w:r>
     </w:p>
     <w:p>
@@ -1046,7 +915,7 @@
           <w:sz w:val="34"/>
           <w:szCs w:val="34"/>
         </w:rPr>
-        <w:t xml:space="preserve">Problemas e Algoritmos — entrada, processamento e saída</w:t>
+        <w:t xml:space="preserve">Representação e Arrays — organizando coleções de dados</w:t>
       </w:r>
     </w:p>
     <w:p>
@@ -1061,7 +930,7 @@
           <w:sz w:val="20"/>
           <w:szCs w:val="20"/>
         </w:rPr>
-        <w:t xml:space="preserve">Aula 4 · Problemas e Algoritmos · Pensamento Computacional</w:t>
+        <w:t xml:space="preserve">Aula 5, 13 · Representação de Processos e Dados / Arrays e Estruturas de Dados · Pensamento Computacional</w:t>
       </w:r>
     </w:p>
     <w:p>
@@ -1093,7 +962,7 @@
           <w:sz w:val="22"/>
           <w:szCs w:val="22"/>
         </w:rPr>
-        <w:t xml:space="preserve">Separar e identificar as três fases de um algoritmo (entrada, processamento, saída) num problema com decisão — cálculo de média com situação de aprovação — testando casos diversos e um caso-limite, como praticado na Aula 4.</w:t>
+        <w:t xml:space="preserve">Praticar transnumeração — a mesma informação em formas diferentes — e depois organizar dados em um array aninhado, percorrendo a estrutura para calcular um resultado, unindo o trabalho das Aulas 5 e 13.</w:t>
       </w:r>
     </w:p>
     <w:p>
@@ -1125,7 +994,7 @@
           <w:sz w:val="22"/>
           <w:szCs w:val="22"/>
         </w:rPr>
-        <w:t xml:space="preserve">Separem claramente as três fases no código: dados de entrada, cálculo e resultado de saída.</w:t>
+        <w:t xml:space="preserve">Primeiro representem os mesmos dados de formas diferentes; depois organizem dados em um array aninhado.</w:t>
       </w:r>
     </w:p>
     <w:tbl>
@@ -1165,35 +1034,175 @@
                 <w:sz w:val="20"/>
                 <w:szCs w:val="20"/>
               </w:rPr>
-              <w:t xml:space="preserve">notas = [7.5, 6.0, 8.2]           # entrada</w:t>
-            </w:r>
-          </w:p>
-          <w:p>
-            <w:pPr>
-              <w:spacing w:after="0"/>
-            </w:pPr>
-            <w:r>
-              <w:rPr>
-                <w:rFonts w:ascii="Courier New" w:cs="Courier New" w:eastAsia="Courier New" w:hAnsi="Courier New"/>
-                <w:color w:val="20303F"/>
-                <w:sz w:val="20"/>
-                <w:szCs w:val="20"/>
-              </w:rPr>
-              <w:t xml:space="preserve">media = sum(notas) / length(notas) # processamento</w:t>
-            </w:r>
-          </w:p>
-          <w:p>
-            <w:pPr>
-              <w:spacing w:after="0"/>
-            </w:pPr>
-            <w:r>
-              <w:rPr>
-                <w:rFonts w:ascii="Courier New" w:cs="Courier New" w:eastAsia="Courier New" w:hAnsi="Courier New"/>
-                <w:color w:val="20303F"/>
-                <w:sz w:val="20"/>
-                <w:szCs w:val="20"/>
-              </w:rPr>
-              <w:t xml:space="preserve">situacao = media &gt;= 6.0 ? "aprovado" : "em recuperação"  # saída</w:t>
+              <w:t xml:space="preserve">frutas = ["maçã", "banana", "maçã", "uva", "banana", "maçã"]</w:t>
+            </w:r>
+          </w:p>
+          <w:p>
+            <w:pPr>
+              <w:spacing w:after="0"/>
+            </w:pPr>
+            <w:r>
+              <w:rPr>
+                <w:rFonts w:ascii="Courier New" w:cs="Courier New" w:eastAsia="Courier New" w:hAnsi="Courier New"/>
+                <w:color w:val="20303F"/>
+                <w:sz w:val="20"/>
+                <w:szCs w:val="20"/>
+              </w:rPr>
+              <w:t xml:space="preserve"> </w:t>
+            </w:r>
+          </w:p>
+          <w:p>
+            <w:pPr>
+              <w:spacing w:after="0"/>
+            </w:pPr>
+            <w:r>
+              <w:rPr>
+                <w:rFonts w:ascii="Courier New" w:cs="Courier New" w:eastAsia="Courier New" w:hAnsi="Courier New"/>
+                <w:color w:val="20303F"/>
+                <w:sz w:val="20"/>
+                <w:szCs w:val="20"/>
+              </w:rPr>
+              <w:t xml:space="preserve">contagem = Dict{String, Int}()</w:t>
+            </w:r>
+          </w:p>
+          <w:p>
+            <w:pPr>
+              <w:spacing w:after="0"/>
+            </w:pPr>
+            <w:r>
+              <w:rPr>
+                <w:rFonts w:ascii="Courier New" w:cs="Courier New" w:eastAsia="Courier New" w:hAnsi="Courier New"/>
+                <w:color w:val="20303F"/>
+                <w:sz w:val="20"/>
+                <w:szCs w:val="20"/>
+              </w:rPr>
+              <w:t xml:space="preserve">for f in frutas</w:t>
+            </w:r>
+          </w:p>
+          <w:p>
+            <w:pPr>
+              <w:spacing w:after="0"/>
+            </w:pPr>
+            <w:r>
+              <w:rPr>
+                <w:rFonts w:ascii="Courier New" w:cs="Courier New" w:eastAsia="Courier New" w:hAnsi="Courier New"/>
+                <w:color w:val="20303F"/>
+                <w:sz w:val="20"/>
+                <w:szCs w:val="20"/>
+              </w:rPr>
+              <w:t xml:space="preserve">    contagem[f] = get(contagem, f, 0) + 1</w:t>
+            </w:r>
+          </w:p>
+          <w:p>
+            <w:pPr>
+              <w:spacing w:after="0"/>
+            </w:pPr>
+            <w:r>
+              <w:rPr>
+                <w:rFonts w:ascii="Courier New" w:cs="Courier New" w:eastAsia="Courier New" w:hAnsi="Courier New"/>
+                <w:color w:val="20303F"/>
+                <w:sz w:val="20"/>
+                <w:szCs w:val="20"/>
+              </w:rPr>
+              <w:t xml:space="preserve">end</w:t>
+            </w:r>
+          </w:p>
+          <w:p>
+            <w:pPr>
+              <w:spacing w:after="0"/>
+            </w:pPr>
+            <w:r>
+              <w:rPr>
+                <w:rFonts w:ascii="Courier New" w:cs="Courier New" w:eastAsia="Courier New" w:hAnsi="Courier New"/>
+                <w:color w:val="20303F"/>
+                <w:sz w:val="20"/>
+                <w:szCs w:val="20"/>
+              </w:rPr>
+              <w:t xml:space="preserve"> </w:t>
+            </w:r>
+          </w:p>
+          <w:p>
+            <w:pPr>
+              <w:spacing w:after="0"/>
+            </w:pPr>
+            <w:r>
+              <w:rPr>
+                <w:rFonts w:ascii="Courier New" w:cs="Courier New" w:eastAsia="Courier New" w:hAnsi="Courier New"/>
+                <w:color w:val="20303F"/>
+                <w:sz w:val="20"/>
+                <w:szCs w:val="20"/>
+              </w:rPr>
+              <w:t xml:space="preserve"># Array aninhado: notas de 2 alunos</w:t>
+            </w:r>
+          </w:p>
+          <w:p>
+            <w:pPr>
+              <w:spacing w:after="0"/>
+            </w:pPr>
+            <w:r>
+              <w:rPr>
+                <w:rFonts w:ascii="Courier New" w:cs="Courier New" w:eastAsia="Courier New" w:hAnsi="Courier New"/>
+                <w:color w:val="20303F"/>
+                <w:sz w:val="20"/>
+                <w:szCs w:val="20"/>
+              </w:rPr>
+              <w:t xml:space="preserve">notas = [</w:t>
+            </w:r>
+          </w:p>
+          <w:p>
+            <w:pPr>
+              <w:spacing w:after="0"/>
+            </w:pPr>
+            <w:r>
+              <w:rPr>
+                <w:rFonts w:ascii="Courier New" w:cs="Courier New" w:eastAsia="Courier New" w:hAnsi="Courier New"/>
+                <w:color w:val="20303F"/>
+                <w:sz w:val="20"/>
+                <w:szCs w:val="20"/>
+              </w:rPr>
+              <w:t xml:space="preserve">    [8.5, 9.0, 7.5],   # Ana</w:t>
+            </w:r>
+          </w:p>
+          <w:p>
+            <w:pPr>
+              <w:spacing w:after="0"/>
+            </w:pPr>
+            <w:r>
+              <w:rPr>
+                <w:rFonts w:ascii="Courier New" w:cs="Courier New" w:eastAsia="Courier New" w:hAnsi="Courier New"/>
+                <w:color w:val="20303F"/>
+                <w:sz w:val="20"/>
+                <w:szCs w:val="20"/>
+              </w:rPr>
+              <w:t xml:space="preserve">    [7.0, 6.5, 8.0],   # João</w:t>
+            </w:r>
+          </w:p>
+          <w:p>
+            <w:pPr>
+              <w:spacing w:after="0"/>
+            </w:pPr>
+            <w:r>
+              <w:rPr>
+                <w:rFonts w:ascii="Courier New" w:cs="Courier New" w:eastAsia="Courier New" w:hAnsi="Courier New"/>
+                <w:color w:val="20303F"/>
+                <w:sz w:val="20"/>
+                <w:szCs w:val="20"/>
+              </w:rPr>
+              <w:t xml:space="preserve">]</w:t>
+            </w:r>
+          </w:p>
+          <w:p>
+            <w:pPr>
+              <w:spacing w:after="0"/>
+            </w:pPr>
+            <w:r>
+              <w:rPr>
+                <w:rFonts w:ascii="Courier New" w:cs="Courier New" w:eastAsia="Courier New" w:hAnsi="Courier New"/>
+                <w:color w:val="20303F"/>
+                <w:sz w:val="20"/>
+                <w:szCs w:val="20"/>
+              </w:rPr>
+              <w:t xml:space="preserve">media_ana = sum(notas[1]) / length(notas[1])</w:t>
             </w:r>
           </w:p>
         </w:tc>
@@ -1210,7 +1219,7 @@
           <w:sz w:val="22"/>
           <w:szCs w:val="22"/>
         </w:rPr>
-        <w:t xml:space="preserve">Testem com pelo menos 3 conjuntos de notas diferentes, incluindo um caso-limite (média exatamente 6.0), e apontem no código onde está cada uma das três fases.</w:t>
+        <w:t xml:space="preserve">Desenhem um gráfico de barras em texto a partir de 'contagem' e comparem com a lista original. Depois, percorram o array aninhado 'notas' com um laço for e calculem a média de cada aluno.</w:t>
       </w:r>
     </w:p>
     <w:p>
@@ -1247,58 +1256,41 @@
           <w:sz w:val="22"/>
           <w:szCs w:val="22"/>
         </w:rPr>
-        <w:t xml:space="preserve">Usem 3 blocos "pergunte e espere" para pedir 3 notas.</w:t>
-      </w:r>
-    </w:p>
-    <w:p>
-      <w:pPr>
-        <w:pStyle w:val="ListParagraph"/>
-        <w:numPr>
-          <w:ilvl w:val="0"/>
-          <w:numId w:val="2"/>
-        </w:numPr>
-        <w:spacing w:after="80"/>
-      </w:pPr>
-      <w:r>
-        <w:rPr>
-          <w:sz w:val="22"/>
-          <w:szCs w:val="22"/>
-        </w:rPr>
-        <w:t xml:space="preserve">Calculem "soma" e "média" com variáveis e blocos de operadores.</w:t>
-      </w:r>
-    </w:p>
-    <w:p>
-      <w:pPr>
-        <w:pStyle w:val="ListParagraph"/>
-        <w:numPr>
-          <w:ilvl w:val="0"/>
-          <w:numId w:val="2"/>
-        </w:numPr>
-        <w:spacing w:after="80"/>
-      </w:pPr>
-      <w:r>
-        <w:rPr>
-          <w:sz w:val="22"/>
-          <w:szCs w:val="22"/>
-        </w:rPr>
-        <w:t xml:space="preserve">Usem "se ... então ... senão" para decidir "aprovado" / "em recuperação", mostrando o resultado com "diga".</w:t>
-      </w:r>
-    </w:p>
-    <w:p>
-      <w:pPr>
-        <w:pStyle w:val="ListParagraph"/>
-        <w:numPr>
-          <w:ilvl w:val="0"/>
-          <w:numId w:val="2"/>
-        </w:numPr>
-        <w:spacing w:after="80"/>
-      </w:pPr>
-      <w:r>
-        <w:rPr>
-          <w:sz w:val="22"/>
-          <w:szCs w:val="22"/>
-        </w:rPr>
-        <w:t xml:space="preserve">Marquem com comentários ou post-its ao lado do script qual bloco representa entrada, qual representa processamento e qual representa saída.</w:t>
+        <w:t xml:space="preserve">Criem uma lista "frutas" com itens repetidos e contem as ocorrências em variáveis (simulando um dicionário); desenhem barras proporcionais com o bloco de caneta.</w:t>
+      </w:r>
+    </w:p>
+    <w:p>
+      <w:pPr>
+        <w:pStyle w:val="ListParagraph"/>
+        <w:numPr>
+          <w:ilvl w:val="0"/>
+          <w:numId w:val="2"/>
+        </w:numPr>
+        <w:spacing w:after="80"/>
+      </w:pPr>
+      <w:r>
+        <w:rPr>
+          <w:sz w:val="22"/>
+          <w:szCs w:val="22"/>
+        </w:rPr>
+        <w:t xml:space="preserve">Criem uma lista "alunos" (array 1D) e, para cada aluno, uma lista separada de notas (representando o array aninhado).</w:t>
+      </w:r>
+    </w:p>
+    <w:p>
+      <w:pPr>
+        <w:pStyle w:val="ListParagraph"/>
+        <w:numPr>
+          <w:ilvl w:val="0"/>
+          <w:numId w:val="2"/>
+        </w:numPr>
+        <w:spacing w:after="80"/>
+      </w:pPr>
+      <w:r>
+        <w:rPr>
+          <w:sz w:val="22"/>
+          <w:szCs w:val="22"/>
+        </w:rPr>
+        <w:t xml:space="preserve">Somem os itens de cada lista de notas e dividam pela quantidade, mostrando a média de cada aluno com "diga".</w:t>
       </w:r>
     </w:p>
     <w:p>
@@ -1335,41 +1327,41 @@
           <w:sz w:val="22"/>
           <w:szCs w:val="22"/>
         </w:rPr>
-        <w:t xml:space="preserve">Montem um "algoritmo humano": uma pessoa representa a entrada (segura fichas com as notas), outra representa o processamento (faz a conta numa lousa) e uma terceira representa a saída (anuncia o resultado).</w:t>
-      </w:r>
-    </w:p>
-    <w:p>
-      <w:pPr>
-        <w:pStyle w:val="ListParagraph"/>
-        <w:numPr>
-          <w:ilvl w:val="0"/>
-          <w:numId w:val="2"/>
-        </w:numPr>
-        <w:spacing w:after="80"/>
-      </w:pPr>
-      <w:r>
-        <w:rPr>
-          <w:sz w:val="22"/>
-          <w:szCs w:val="22"/>
-        </w:rPr>
-        <w:t xml:space="preserve">Testem com 3 conjuntos de notas diferentes, escritos em fichas, passando-as fisicamente entre as três estações.</w:t>
-      </w:r>
-    </w:p>
-    <w:p>
-      <w:pPr>
-        <w:pStyle w:val="ListParagraph"/>
-        <w:numPr>
-          <w:ilvl w:val="0"/>
-          <w:numId w:val="2"/>
-        </w:numPr>
-        <w:spacing w:after="80"/>
-      </w:pPr>
-      <w:r>
-        <w:rPr>
-          <w:sz w:val="22"/>
-          <w:szCs w:val="22"/>
-        </w:rPr>
-        <w:t xml:space="preserve">O professor entrega um conjunto de notas com um valor inválido (ex.: uma nota "25") e o grupo discute em qual estação esse erro deveria ser detectado.</w:t>
+        <w:t xml:space="preserve">Espalhem fichas de frutas repetidas sobre a mesa (lista), depois reorganizem em pilhas por tipo (contagem) e depois em colunas lado a lado (gráfico) — comparando as três representações.</w:t>
+      </w:r>
+    </w:p>
+    <w:p>
+      <w:pPr>
+        <w:pStyle w:val="ListParagraph"/>
+        <w:numPr>
+          <w:ilvl w:val="0"/>
+          <w:numId w:val="2"/>
+        </w:numPr>
+        <w:spacing w:after="80"/>
+      </w:pPr>
+      <w:r>
+        <w:rPr>
+          <w:sz w:val="22"/>
+          <w:szCs w:val="22"/>
+        </w:rPr>
+        <w:t xml:space="preserve">Organizem uma fileira de fichas com nomes de alunos e, abaixo de cada nome, um envelope com fichas de notas (array aninhado); cada grupo calcula a média do seu envelope.</w:t>
+      </w:r>
+    </w:p>
+    <w:p>
+      <w:pPr>
+        <w:pStyle w:val="ListParagraph"/>
+        <w:numPr>
+          <w:ilvl w:val="0"/>
+          <w:numId w:val="2"/>
+        </w:numPr>
+        <w:spacing w:after="80"/>
+      </w:pPr>
+      <w:r>
+        <w:rPr>
+          <w:sz w:val="22"/>
+          <w:szCs w:val="22"/>
+        </w:rPr>
+        <w:t xml:space="preserve">Discutam: qual representação de frutas facilita ver "qual aparece mais"? E como vocês localizariam "a segunda nota do primeiro aluno" dentro dos envelopes?</w:t>
       </w:r>
     </w:p>
     <w:p>
@@ -1401,7 +1393,7 @@
           <w:sz w:val="20"/>
           <w:szCs w:val="20"/>
         </w:rPr>
-        <w:t xml:space="preserve">decomposição do algoritmo em fases e teste/depuração.</w:t>
+        <w:t xml:space="preserve">representação, manipulação e transnumeração; organização de coleções, incluindo estruturas aninhadas.</w:t>
       </w:r>
     </w:p>
     <w:p>
@@ -1434,7 +1426,7 @@
           <w:sz w:val="34"/>
           <w:szCs w:val="34"/>
         </w:rPr>
-        <w:t xml:space="preserve">Representação — a mesma informação em formas diferentes</w:t>
+        <w:t xml:space="preserve">Decomposição, Generalização e Transformação — as três técnicas juntas</w:t>
       </w:r>
     </w:p>
     <w:p>
@@ -1449,7 +1441,7 @@
           <w:sz w:val="20"/>
           <w:szCs w:val="20"/>
         </w:rPr>
-        <w:t xml:space="preserve">Aula 5 · Representação de Processos e Dados · Pensamento Computacional</w:t>
+        <w:t xml:space="preserve">Aula 6, 7, 8 · Decomposição, Generalização e Transformação · Pensamento Computacional</w:t>
       </w:r>
     </w:p>
     <w:p>
@@ -1481,7 +1473,7 @@
           <w:sz w:val="22"/>
           <w:szCs w:val="22"/>
         </w:rPr>
-        <w:t xml:space="preserve">Praticar transnumeração: representar o mesmo conjunto de dados como lista, como contagem (dicionário) e como gráfico, comparando o que cada forma revela — como trabalhado na Aula 5.</w:t>
+        <w:t xml:space="preserve">Aplicar as três técnicas de construção de algoritmos num só problema: decompor o cálculo do preço de uma compra em subfunções, generalizá-las com parâmetros e, por fim, transformá-las num pipeline aplicado a vários pedidos — unindo as Aulas 6, 7 e 8.</w:t>
       </w:r>
     </w:p>
     <w:p>
@@ -1513,7 +1505,7 @@
           <w:sz w:val="22"/>
           <w:szCs w:val="22"/>
         </w:rPr>
-        <w:t xml:space="preserve">Partam de uma lista de itens repetidos e transformem-na em contagem.</w:t>
+        <w:t xml:space="preserve">Decomponham o cálculo, generalizem com parâmetros, e apliquem o pipeline a uma lista de pedidos.</w:t>
       </w:r>
     </w:p>
     <w:tbl>
@@ -1553,7 +1545,49 @@
                 <w:sz w:val="20"/>
                 <w:szCs w:val="20"/>
               </w:rPr>
-              <w:t xml:space="preserve">frutas = ["maçã", "banana", "maçã", "uva", "banana", "maçã"]</w:t>
+              <w:t xml:space="preserve"># Decomposição: subfunções menores</w:t>
+            </w:r>
+          </w:p>
+          <w:p>
+            <w:pPr>
+              <w:spacing w:after="0"/>
+            </w:pPr>
+            <w:r>
+              <w:rPr>
+                <w:rFonts w:ascii="Courier New" w:cs="Courier New" w:eastAsia="Courier New" w:hAnsi="Courier New"/>
+                <w:color w:val="20303F"/>
+                <w:sz w:val="20"/>
+                <w:szCs w:val="20"/>
+              </w:rPr>
+              <w:t xml:space="preserve">subtotal(precos) = sum(precos)</w:t>
+            </w:r>
+          </w:p>
+          <w:p>
+            <w:pPr>
+              <w:spacing w:after="0"/>
+            </w:pPr>
+            <w:r>
+              <w:rPr>
+                <w:rFonts w:ascii="Courier New" w:cs="Courier New" w:eastAsia="Courier New" w:hAnsi="Courier New"/>
+                <w:color w:val="20303F"/>
+                <w:sz w:val="20"/>
+                <w:szCs w:val="20"/>
+              </w:rPr>
+              <w:t xml:space="preserve">frete(peso) = peso &gt; 5 ? 20.0 : 10.0</w:t>
+            </w:r>
+          </w:p>
+          <w:p>
+            <w:pPr>
+              <w:spacing w:after="0"/>
+            </w:pPr>
+            <w:r>
+              <w:rPr>
+                <w:rFonts w:ascii="Courier New" w:cs="Courier New" w:eastAsia="Courier New" w:hAnsi="Courier New"/>
+                <w:color w:val="20303F"/>
+                <w:sz w:val="20"/>
+                <w:szCs w:val="20"/>
+              </w:rPr>
+              <w:t xml:space="preserve">desconto(valor, cupom) = cupom ? valor * 0.9 : valor</w:t>
             </w:r>
           </w:p>
           <w:p>
@@ -1581,49 +1615,119 @@
                 <w:sz w:val="20"/>
                 <w:szCs w:val="20"/>
               </w:rPr>
-              <w:t xml:space="preserve">contagem = Dict{String, Int}()</w:t>
-            </w:r>
-          </w:p>
-          <w:p>
-            <w:pPr>
-              <w:spacing w:after="0"/>
-            </w:pPr>
-            <w:r>
-              <w:rPr>
-                <w:rFonts w:ascii="Courier New" w:cs="Courier New" w:eastAsia="Courier New" w:hAnsi="Courier New"/>
-                <w:color w:val="20303F"/>
-                <w:sz w:val="20"/>
-                <w:szCs w:val="20"/>
-              </w:rPr>
-              <w:t xml:space="preserve">for f in frutas</w:t>
-            </w:r>
-          </w:p>
-          <w:p>
-            <w:pPr>
-              <w:spacing w:after="0"/>
-            </w:pPr>
-            <w:r>
-              <w:rPr>
-                <w:rFonts w:ascii="Courier New" w:cs="Courier New" w:eastAsia="Courier New" w:hAnsi="Courier New"/>
-                <w:color w:val="20303F"/>
-                <w:sz w:val="20"/>
-                <w:szCs w:val="20"/>
-              </w:rPr>
-              <w:t xml:space="preserve">    contagem[f] = get(contagem, f, 0) + 1</w:t>
-            </w:r>
-          </w:p>
-          <w:p>
-            <w:pPr>
-              <w:spacing w:after="0"/>
-            </w:pPr>
-            <w:r>
-              <w:rPr>
-                <w:rFonts w:ascii="Courier New" w:cs="Courier New" w:eastAsia="Courier New" w:hAnsi="Courier New"/>
-                <w:color w:val="20303F"/>
-                <w:sz w:val="20"/>
-                <w:szCs w:val="20"/>
-              </w:rPr>
-              <w:t xml:space="preserve">end</w:t>
+              <w:t xml:space="preserve"># Generalização: uma função parametrizada que combina as partes</w:t>
+            </w:r>
+          </w:p>
+          <w:p>
+            <w:pPr>
+              <w:spacing w:after="0"/>
+            </w:pPr>
+            <w:r>
+              <w:rPr>
+                <w:rFonts w:ascii="Courier New" w:cs="Courier New" w:eastAsia="Courier New" w:hAnsi="Courier New"/>
+                <w:color w:val="20303F"/>
+                <w:sz w:val="20"/>
+                <w:szCs w:val="20"/>
+              </w:rPr>
+              <w:t xml:space="preserve">preco_final(precos, peso, cupom) = desconto(subtotal(precos), cupom) + frete(peso)</w:t>
+            </w:r>
+          </w:p>
+          <w:p>
+            <w:pPr>
+              <w:spacing w:after="0"/>
+            </w:pPr>
+            <w:r>
+              <w:rPr>
+                <w:rFonts w:ascii="Courier New" w:cs="Courier New" w:eastAsia="Courier New" w:hAnsi="Courier New"/>
+                <w:color w:val="20303F"/>
+                <w:sz w:val="20"/>
+                <w:szCs w:val="20"/>
+              </w:rPr>
+              <w:t xml:space="preserve"> </w:t>
+            </w:r>
+          </w:p>
+          <w:p>
+            <w:pPr>
+              <w:spacing w:after="0"/>
+            </w:pPr>
+            <w:r>
+              <w:rPr>
+                <w:rFonts w:ascii="Courier New" w:cs="Courier New" w:eastAsia="Courier New" w:hAnsi="Courier New"/>
+                <w:color w:val="20303F"/>
+                <w:sz w:val="20"/>
+                <w:szCs w:val="20"/>
+              </w:rPr>
+              <w:t xml:space="preserve"># Transformação: pipeline aplicado a uma lista de pedidos</w:t>
+            </w:r>
+          </w:p>
+          <w:p>
+            <w:pPr>
+              <w:spacing w:after="0"/>
+            </w:pPr>
+            <w:r>
+              <w:rPr>
+                <w:rFonts w:ascii="Courier New" w:cs="Courier New" w:eastAsia="Courier New" w:hAnsi="Courier New"/>
+                <w:color w:val="20303F"/>
+                <w:sz w:val="20"/>
+                <w:szCs w:val="20"/>
+              </w:rPr>
+              <w:t xml:space="preserve">pedidos = [</w:t>
+            </w:r>
+          </w:p>
+          <w:p>
+            <w:pPr>
+              <w:spacing w:after="0"/>
+            </w:pPr>
+            <w:r>
+              <w:rPr>
+                <w:rFonts w:ascii="Courier New" w:cs="Courier New" w:eastAsia="Courier New" w:hAnsi="Courier New"/>
+                <w:color w:val="20303F"/>
+                <w:sz w:val="20"/>
+                <w:szCs w:val="20"/>
+              </w:rPr>
+              <w:t xml:space="preserve">    (precos=[10.0, 20.0], peso=3, cupom=false),</w:t>
+            </w:r>
+          </w:p>
+          <w:p>
+            <w:pPr>
+              <w:spacing w:after="0"/>
+            </w:pPr>
+            <w:r>
+              <w:rPr>
+                <w:rFonts w:ascii="Courier New" w:cs="Courier New" w:eastAsia="Courier New" w:hAnsi="Courier New"/>
+                <w:color w:val="20303F"/>
+                <w:sz w:val="20"/>
+                <w:szCs w:val="20"/>
+              </w:rPr>
+              <w:t xml:space="preserve">    (precos=[50.0, 5.0], peso=6, cupom=true),</w:t>
+            </w:r>
+          </w:p>
+          <w:p>
+            <w:pPr>
+              <w:spacing w:after="0"/>
+            </w:pPr>
+            <w:r>
+              <w:rPr>
+                <w:rFonts w:ascii="Courier New" w:cs="Courier New" w:eastAsia="Courier New" w:hAnsi="Courier New"/>
+                <w:color w:val="20303F"/>
+                <w:sz w:val="20"/>
+                <w:szCs w:val="20"/>
+              </w:rPr>
+              <w:t xml:space="preserve">]</w:t>
+            </w:r>
+          </w:p>
+          <w:p>
+            <w:pPr>
+              <w:spacing w:after="0"/>
+            </w:pPr>
+            <w:r>
+              <w:rPr>
+                <w:rFonts w:ascii="Courier New" w:cs="Courier New" w:eastAsia="Courier New" w:hAnsi="Courier New"/>
+                <w:color w:val="20303F"/>
+                <w:sz w:val="20"/>
+                <w:szCs w:val="20"/>
+              </w:rPr>
+              <w:t xml:space="preserve">totais = [preco_final(p.precos, p.peso, p.cupom) for p in pedidos]</w:t>
             </w:r>
           </w:p>
         </w:tc>
@@ -1640,7 +1744,7 @@
           <w:sz w:val="22"/>
           <w:szCs w:val="22"/>
         </w:rPr>
-        <w:t xml:space="preserve">Depois de calcular "contagem", desenhem um gráfico de barras simples em texto (usando asteriscos, uma linha por fruta) e comparem: o que a lista mostra que o gráfico não mostra, e vice-versa?</w:t>
+        <w:t xml:space="preserve">Testem cada subfunção isoladamente (decomposição); testem preco_final com um caso extremo, como peso = 0 (generalização); e comparem, para cada pedido, o dado bruto (entrada) com o total calculado (saída) — o antes e o depois do pipeline (transformação).</w:t>
       </w:r>
     </w:p>
     <w:p>
@@ -1677,58 +1781,41 @@
           <w:sz w:val="22"/>
           <w:szCs w:val="22"/>
         </w:rPr>
-        <w:t xml:space="preserve">Criem uma lista "frutas" e adicionem itens repetidos.</w:t>
-      </w:r>
-    </w:p>
-    <w:p>
-      <w:pPr>
-        <w:pStyle w:val="ListParagraph"/>
-        <w:numPr>
-          <w:ilvl w:val="0"/>
-          <w:numId w:val="2"/>
-        </w:numPr>
-        <w:spacing w:after="80"/>
-      </w:pPr>
-      <w:r>
-        <w:rPr>
-          <w:sz w:val="22"/>
-          <w:szCs w:val="22"/>
-        </w:rPr>
-        <w:t xml:space="preserve">Com um bloco "para cada item da lista", contem as ocorrências em variáveis separadas (uma por fruta) — simulando um "dicionário".</w:t>
-      </w:r>
-    </w:p>
-    <w:p>
-      <w:pPr>
-        <w:pStyle w:val="ListParagraph"/>
-        <w:numPr>
-          <w:ilvl w:val="0"/>
-          <w:numId w:val="2"/>
-        </w:numPr>
-        <w:spacing w:after="80"/>
-      </w:pPr>
-      <w:r>
-        <w:rPr>
-          <w:sz w:val="22"/>
-          <w:szCs w:val="22"/>
-        </w:rPr>
-        <w:t xml:space="preserve">Desenhem barras na tela com o bloco de caneta ("pen"), com comprimento proporcional à contagem de cada fruta.</w:t>
-      </w:r>
-    </w:p>
-    <w:p>
-      <w:pPr>
-        <w:pStyle w:val="ListParagraph"/>
-        <w:numPr>
-          <w:ilvl w:val="0"/>
-          <w:numId w:val="2"/>
-        </w:numPr>
-        <w:spacing w:after="80"/>
-      </w:pPr>
-      <w:r>
-        <w:rPr>
-          <w:sz w:val="22"/>
-          <w:szCs w:val="22"/>
-        </w:rPr>
-        <w:t xml:space="preserve">Comparem com a lista original, mostrada num balão de fala ao lado do gráfico.</w:t>
+        <w:t xml:space="preserve">Criem 3 blocos personalizados: "calcular subtotal", "calcular frete" e "aplicar desconto" — testando cada um isoladamente (decomposição).</w:t>
+      </w:r>
+    </w:p>
+    <w:p>
+      <w:pPr>
+        <w:pStyle w:val="ListParagraph"/>
+        <w:numPr>
+          <w:ilvl w:val="0"/>
+          <w:numId w:val="2"/>
+        </w:numPr>
+        <w:spacing w:after="80"/>
+      </w:pPr>
+      <w:r>
+        <w:rPr>
+          <w:sz w:val="22"/>
+          <w:szCs w:val="22"/>
+        </w:rPr>
+        <w:t xml:space="preserve">Combinem os três num bloco "preço final" reutilizável, com parâmetros para qualquer pedido (generalização), e testem um caso extremo (peso 0).</w:t>
+      </w:r>
+    </w:p>
+    <w:p>
+      <w:pPr>
+        <w:pStyle w:val="ListParagraph"/>
+        <w:numPr>
+          <w:ilvl w:val="0"/>
+          <w:numId w:val="2"/>
+        </w:numPr>
+        <w:spacing w:after="80"/>
+      </w:pPr>
+      <w:r>
+        <w:rPr>
+          <w:sz w:val="22"/>
+          <w:szCs w:val="22"/>
+        </w:rPr>
+        <w:t xml:space="preserve">Rodem o bloco combinado para uma lista de 2 a 3 "pedidos" diferentes, mostrando o total de cada um e comparando com o pedido bruto (transformação em pipeline).</w:t>
       </w:r>
     </w:p>
     <w:p>
@@ -1765,58 +1852,41 @@
           <w:sz w:val="22"/>
           <w:szCs w:val="22"/>
         </w:rPr>
-        <w:t xml:space="preserve">Espalhem fichas (ou blocos de montar coloridos) representando as mesmas frutas repetidas sobre uma mesa — representação em lista/coleção desorganizada.</w:t>
-      </w:r>
-    </w:p>
-    <w:p>
-      <w:pPr>
-        <w:pStyle w:val="ListParagraph"/>
-        <w:numPr>
-          <w:ilvl w:val="0"/>
-          <w:numId w:val="2"/>
-        </w:numPr>
-        <w:spacing w:after="80"/>
-      </w:pPr>
-      <w:r>
-        <w:rPr>
-          <w:sz w:val="22"/>
-          <w:szCs w:val="22"/>
-        </w:rPr>
-        <w:t xml:space="preserve">Os alunos reorganizam as fichas em pilhas por tipo — representação em contagem.</w:t>
-      </w:r>
-    </w:p>
-    <w:p>
-      <w:pPr>
-        <w:pStyle w:val="ListParagraph"/>
-        <w:numPr>
-          <w:ilvl w:val="0"/>
-          <w:numId w:val="2"/>
-        </w:numPr>
-        <w:spacing w:after="80"/>
-      </w:pPr>
-      <w:r>
-        <w:rPr>
-          <w:sz w:val="22"/>
-          <w:szCs w:val="22"/>
-        </w:rPr>
-        <w:t xml:space="preserve">Depois empilham os blocos por cor em colunas lado a lado — representação em gráfico.</w:t>
-      </w:r>
-    </w:p>
-    <w:p>
-      <w:pPr>
-        <w:pStyle w:val="ListParagraph"/>
-        <w:numPr>
-          <w:ilvl w:val="0"/>
-          <w:numId w:val="2"/>
-        </w:numPr>
-        <w:spacing w:after="80"/>
-      </w:pPr>
-      <w:r>
-        <w:rPr>
-          <w:sz w:val="22"/>
-          <w:szCs w:val="22"/>
-        </w:rPr>
-        <w:t xml:space="preserve">Discutam: qual das três representações facilita responder "qual fruta aparece mais"? E "qual foi a ordem de chegada"?</w:t>
+        <w:t xml:space="preserve">3 grupos calculam cada parte separadamente em cartazes: "subtotal", "frete", "desconto" (decomposição).</w:t>
+      </w:r>
+    </w:p>
+    <w:p>
+      <w:pPr>
+        <w:pStyle w:val="ListParagraph"/>
+        <w:numPr>
+          <w:ilvl w:val="0"/>
+          <w:numId w:val="2"/>
+        </w:numPr>
+        <w:spacing w:after="80"/>
+      </w:pPr>
+      <w:r>
+        <w:rPr>
+          <w:sz w:val="22"/>
+          <w:szCs w:val="22"/>
+        </w:rPr>
+        <w:t xml:space="preserve">Um quarto grupo ("montador") combina as três partes numa fórmula geral, testada com pedidos variados, incluindo um caso extremo como peso 0 (generalização).</w:t>
+      </w:r>
+    </w:p>
+    <w:p>
+      <w:pPr>
+        <w:pStyle w:val="ListParagraph"/>
+        <w:numPr>
+          <w:ilvl w:val="0"/>
+          <w:numId w:val="2"/>
+        </w:numPr>
+        <w:spacing w:after="80"/>
+      </w:pPr>
+      <w:r>
+        <w:rPr>
+          <w:sz w:val="22"/>
+          <w:szCs w:val="22"/>
+        </w:rPr>
+        <w:t xml:space="preserve">Montem uma linha de montagem física: uma fila de fichas de pedidos passa pelas três estações em sequência até chegar ao preço final, e comparem o pedido bruto com o resultado final de cada ficha (transformação).</w:t>
       </w:r>
     </w:p>
     <w:p>
@@ -1848,7 +1918,7 @@
           <w:sz w:val="20"/>
           <w:szCs w:val="20"/>
         </w:rPr>
-        <w:t xml:space="preserve">representação, manipulação e transnumeração.</w:t>
+        <w:t xml:space="preserve">decomposição, generalização e transformação como técnicas de construção de algoritmos.</w:t>
       </w:r>
     </w:p>
     <w:p>
@@ -1881,7 +1951,7 @@
           <w:sz w:val="34"/>
           <w:szCs w:val="34"/>
         </w:rPr>
-        <w:t xml:space="preserve">Decomposição — dividir para resolver</w:t>
+        <w:t xml:space="preserve">Abstração e Especialização — do conceito geral ao específico</w:t>
       </w:r>
     </w:p>
     <w:p>
@@ -1896,7 +1966,7 @@
           <w:sz w:val="20"/>
           <w:szCs w:val="20"/>
         </w:rPr>
-        <w:t xml:space="preserve">Aula 6 · Decomposição · Pensamento Computacional</w:t>
+        <w:t xml:space="preserve">Aula 10 · Abstração e Especialização em Computação · Pensamento Computacional</w:t>
       </w:r>
     </w:p>
     <w:p>
@@ -1928,7 +1998,7 @@
           <w:sz w:val="22"/>
           <w:szCs w:val="22"/>
         </w:rPr>
-        <w:t xml:space="preserve">Dividir um problema composto (calcular o preço final de uma compra) em subproblemas menores, resolvendo e testando cada parte isoladamente antes de combiná-las — como praticado na Aula 6.</w:t>
+        <w:t xml:space="preserve">Criar um tipo genérico (abstrato) e pelo menos duas especializações concretas que herdam o que é comum e acrescentam o que é próprio — a mesma dupla abstração/especialização trabalhada na Aula 10.</w:t>
       </w:r>
     </w:p>
     <w:p>
@@ -1960,7 +2030,7 @@
           <w:sz w:val="22"/>
           <w:szCs w:val="22"/>
         </w:rPr>
-        <w:t xml:space="preserve">Decomponham o cálculo em três funções menores antes de combiná-las.</w:t>
+        <w:t xml:space="preserve">Definam um tipo abstrato e duas especializações com um comportamento comum (descrever).</w:t>
       </w:r>
     </w:p>
     <w:tbl>
@@ -2000,35 +2070,7 @@
                 <w:sz w:val="20"/>
                 <w:szCs w:val="20"/>
               </w:rPr>
-              <w:t xml:space="preserve">subtotal(precos) = sum(precos)</w:t>
-            </w:r>
-          </w:p>
-          <w:p>
-            <w:pPr>
-              <w:spacing w:after="0"/>
-            </w:pPr>
-            <w:r>
-              <w:rPr>
-                <w:rFonts w:ascii="Courier New" w:cs="Courier New" w:eastAsia="Courier New" w:hAnsi="Courier New"/>
-                <w:color w:val="20303F"/>
-                <w:sz w:val="20"/>
-                <w:szCs w:val="20"/>
-              </w:rPr>
-              <w:t xml:space="preserve">frete(peso) = peso &gt; 5 ? 20.0 : 10.0</w:t>
-            </w:r>
-          </w:p>
-          <w:p>
-            <w:pPr>
-              <w:spacing w:after="0"/>
-            </w:pPr>
-            <w:r>
-              <w:rPr>
-                <w:rFonts w:ascii="Courier New" w:cs="Courier New" w:eastAsia="Courier New" w:hAnsi="Courier New"/>
-                <w:color w:val="20303F"/>
-                <w:sz w:val="20"/>
-                <w:szCs w:val="20"/>
-              </w:rPr>
-              <w:t xml:space="preserve">desconto(valor, cupom) = cupom ? valor * 0.9 : valor</w:t>
+              <w:t xml:space="preserve">abstract type Veiculo end</w:t>
             </w:r>
           </w:p>
           <w:p>
@@ -2056,7 +2098,175 @@
                 <w:sz w:val="20"/>
                 <w:szCs w:val="20"/>
               </w:rPr>
-              <w:t xml:space="preserve">preco_final(precos, peso, cupom) = desconto(subtotal(precos), cupom) + frete(peso)</w:t>
+              <w:t xml:space="preserve">struct Carro &lt;: Veiculo</w:t>
+            </w:r>
+          </w:p>
+          <w:p>
+            <w:pPr>
+              <w:spacing w:after="0"/>
+            </w:pPr>
+            <w:r>
+              <w:rPr>
+                <w:rFonts w:ascii="Courier New" w:cs="Courier New" w:eastAsia="Courier New" w:hAnsi="Courier New"/>
+                <w:color w:val="20303F"/>
+                <w:sz w:val="20"/>
+                <w:szCs w:val="20"/>
+              </w:rPr>
+              <w:t xml:space="preserve">    rodas::Int</w:t>
+            </w:r>
+          </w:p>
+          <w:p>
+            <w:pPr>
+              <w:spacing w:after="0"/>
+            </w:pPr>
+            <w:r>
+              <w:rPr>
+                <w:rFonts w:ascii="Courier New" w:cs="Courier New" w:eastAsia="Courier New" w:hAnsi="Courier New"/>
+                <w:color w:val="20303F"/>
+                <w:sz w:val="20"/>
+                <w:szCs w:val="20"/>
+              </w:rPr>
+              <w:t xml:space="preserve">    combustivel::String</w:t>
+            </w:r>
+          </w:p>
+          <w:p>
+            <w:pPr>
+              <w:spacing w:after="0"/>
+            </w:pPr>
+            <w:r>
+              <w:rPr>
+                <w:rFonts w:ascii="Courier New" w:cs="Courier New" w:eastAsia="Courier New" w:hAnsi="Courier New"/>
+                <w:color w:val="20303F"/>
+                <w:sz w:val="20"/>
+                <w:szCs w:val="20"/>
+              </w:rPr>
+              <w:t xml:space="preserve">end</w:t>
+            </w:r>
+          </w:p>
+          <w:p>
+            <w:pPr>
+              <w:spacing w:after="0"/>
+            </w:pPr>
+            <w:r>
+              <w:rPr>
+                <w:rFonts w:ascii="Courier New" w:cs="Courier New" w:eastAsia="Courier New" w:hAnsi="Courier New"/>
+                <w:color w:val="20303F"/>
+                <w:sz w:val="20"/>
+                <w:szCs w:val="20"/>
+              </w:rPr>
+              <w:t xml:space="preserve"> </w:t>
+            </w:r>
+          </w:p>
+          <w:p>
+            <w:pPr>
+              <w:spacing w:after="0"/>
+            </w:pPr>
+            <w:r>
+              <w:rPr>
+                <w:rFonts w:ascii="Courier New" w:cs="Courier New" w:eastAsia="Courier New" w:hAnsi="Courier New"/>
+                <w:color w:val="20303F"/>
+                <w:sz w:val="20"/>
+                <w:szCs w:val="20"/>
+              </w:rPr>
+              <w:t xml:space="preserve">struct Bicicleta &lt;: Veiculo</w:t>
+            </w:r>
+          </w:p>
+          <w:p>
+            <w:pPr>
+              <w:spacing w:after="0"/>
+            </w:pPr>
+            <w:r>
+              <w:rPr>
+                <w:rFonts w:ascii="Courier New" w:cs="Courier New" w:eastAsia="Courier New" w:hAnsi="Courier New"/>
+                <w:color w:val="20303F"/>
+                <w:sz w:val="20"/>
+                <w:szCs w:val="20"/>
+              </w:rPr>
+              <w:t xml:space="preserve">    rodas::Int</w:t>
+            </w:r>
+          </w:p>
+          <w:p>
+            <w:pPr>
+              <w:spacing w:after="0"/>
+            </w:pPr>
+            <w:r>
+              <w:rPr>
+                <w:rFonts w:ascii="Courier New" w:cs="Courier New" w:eastAsia="Courier New" w:hAnsi="Courier New"/>
+                <w:color w:val="20303F"/>
+                <w:sz w:val="20"/>
+                <w:szCs w:val="20"/>
+              </w:rPr>
+              <w:t xml:space="preserve">end</w:t>
+            </w:r>
+          </w:p>
+          <w:p>
+            <w:pPr>
+              <w:spacing w:after="0"/>
+            </w:pPr>
+            <w:r>
+              <w:rPr>
+                <w:rFonts w:ascii="Courier New" w:cs="Courier New" w:eastAsia="Courier New" w:hAnsi="Courier New"/>
+                <w:color w:val="20303F"/>
+                <w:sz w:val="20"/>
+                <w:szCs w:val="20"/>
+              </w:rPr>
+              <w:t xml:space="preserve"> </w:t>
+            </w:r>
+          </w:p>
+          <w:p>
+            <w:pPr>
+              <w:spacing w:after="0"/>
+            </w:pPr>
+            <w:r>
+              <w:rPr>
+                <w:rFonts w:ascii="Courier New" w:cs="Courier New" w:eastAsia="Courier New" w:hAnsi="Courier New"/>
+                <w:color w:val="20303F"/>
+                <w:sz w:val="20"/>
+                <w:szCs w:val="20"/>
+              </w:rPr>
+              <w:t xml:space="preserve">descrever(v::Carro) = "Carro com $(v.rodas) rodas, movido a $(v.combustivel)"</w:t>
+            </w:r>
+          </w:p>
+          <w:p>
+            <w:pPr>
+              <w:spacing w:after="0"/>
+            </w:pPr>
+            <w:r>
+              <w:rPr>
+                <w:rFonts w:ascii="Courier New" w:cs="Courier New" w:eastAsia="Courier New" w:hAnsi="Courier New"/>
+                <w:color w:val="20303F"/>
+                <w:sz w:val="20"/>
+                <w:szCs w:val="20"/>
+              </w:rPr>
+              <w:t xml:space="preserve">descrever(v::Bicicleta) = "Bicicleta com $(v.rodas) rodas"</w:t>
+            </w:r>
+          </w:p>
+          <w:p>
+            <w:pPr>
+              <w:spacing w:after="0"/>
+            </w:pPr>
+            <w:r>
+              <w:rPr>
+                <w:rFonts w:ascii="Courier New" w:cs="Courier New" w:eastAsia="Courier New" w:hAnsi="Courier New"/>
+                <w:color w:val="20303F"/>
+                <w:sz w:val="20"/>
+                <w:szCs w:val="20"/>
+              </w:rPr>
+              <w:t xml:space="preserve"> </w:t>
+            </w:r>
+          </w:p>
+          <w:p>
+            <w:pPr>
+              <w:spacing w:after="0"/>
+            </w:pPr>
+            <w:r>
+              <w:rPr>
+                <w:rFonts w:ascii="Courier New" w:cs="Courier New" w:eastAsia="Courier New" w:hAnsi="Courier New"/>
+                <w:color w:val="20303F"/>
+                <w:sz w:val="20"/>
+                <w:szCs w:val="20"/>
+              </w:rPr>
+              <w:t xml:space="preserve">veiculos = [Carro(4, "gasolina"), Bicicleta(2)]</w:t>
             </w:r>
           </w:p>
         </w:tc>
@@ -2073,7 +2283,7 @@
           <w:sz w:val="22"/>
           <w:szCs w:val="22"/>
         </w:rPr>
-        <w:t xml:space="preserve">Testem cada subfunção isoladamente (com valores simples) antes de testar a função combinada preco_final.</w:t>
+        <w:t xml:space="preserve">Testem a função descrever para cada veículo da lista e acrescentem um terceiro tipo (ex.: Moto) especializando Veiculo com pelo menos um atributo próprio.</w:t>
       </w:r>
     </w:p>
     <w:p>
@@ -2110,41 +2320,58 @@
           <w:sz w:val="22"/>
           <w:szCs w:val="22"/>
         </w:rPr>
-        <w:t xml:space="preserve">Criem 3 blocos personalizados separados: "calcular subtotal", "calcular frete" e "aplicar desconto".</w:t>
-      </w:r>
-    </w:p>
-    <w:p>
-      <w:pPr>
-        <w:pStyle w:val="ListParagraph"/>
-        <w:numPr>
-          <w:ilvl w:val="0"/>
-          <w:numId w:val="2"/>
-        </w:numPr>
-        <w:spacing w:after="80"/>
-      </w:pPr>
-      <w:r>
-        <w:rPr>
-          <w:sz w:val="22"/>
-          <w:szCs w:val="22"/>
-        </w:rPr>
-        <w:t xml:space="preserve">Testem cada bloco isoladamente, mostrando o resultado com "diga", antes de combiná-los.</w:t>
-      </w:r>
-    </w:p>
-    <w:p>
-      <w:pPr>
-        <w:pStyle w:val="ListParagraph"/>
-        <w:numPr>
-          <w:ilvl w:val="0"/>
-          <w:numId w:val="2"/>
-        </w:numPr>
-        <w:spacing w:after="80"/>
-      </w:pPr>
-      <w:r>
-        <w:rPr>
-          <w:sz w:val="22"/>
-          <w:szCs w:val="22"/>
-        </w:rPr>
-        <w:t xml:space="preserve">Combinem os três num bloco final "calcular preço total", que chama os três anteriores em sequência.</w:t>
+        <w:t xml:space="preserve">Criem dois sprites especializados, "Carro" e "Bicicleta" (o "Veículo" genérico existe só como ideia, sem sprite próprio).</w:t>
+      </w:r>
+    </w:p>
+    <w:p>
+      <w:pPr>
+        <w:pStyle w:val="ListParagraph"/>
+        <w:numPr>
+          <w:ilvl w:val="0"/>
+          <w:numId w:val="2"/>
+        </w:numPr>
+        <w:spacing w:after="80"/>
+      </w:pPr>
+      <w:r>
+        <w:rPr>
+          <w:sz w:val="22"/>
+          <w:szCs w:val="22"/>
+        </w:rPr>
+        <w:t xml:space="preserve">Deem a cada sprite variáveis próprias (ex.: "rodas" nos dois, "combustível" só no Carro).</w:t>
+      </w:r>
+    </w:p>
+    <w:p>
+      <w:pPr>
+        <w:pStyle w:val="ListParagraph"/>
+        <w:numPr>
+          <w:ilvl w:val="0"/>
+          <w:numId w:val="2"/>
+        </w:numPr>
+        <w:spacing w:after="80"/>
+      </w:pPr>
+      <w:r>
+        <w:rPr>
+          <w:sz w:val="22"/>
+          <w:szCs w:val="22"/>
+        </w:rPr>
+        <w:t xml:space="preserve">Criem em cada sprite um bloco personalizado "descrever" que mostra suas características com "diga".</w:t>
+      </w:r>
+    </w:p>
+    <w:p>
+      <w:pPr>
+        <w:pStyle w:val="ListParagraph"/>
+        <w:numPr>
+          <w:ilvl w:val="0"/>
+          <w:numId w:val="2"/>
+        </w:numPr>
+        <w:spacing w:after="80"/>
+      </w:pPr>
+      <w:r>
+        <w:rPr>
+          <w:sz w:val="22"/>
+          <w:szCs w:val="22"/>
+        </w:rPr>
+        <w:t xml:space="preserve">Executem clicando em cada sprite e comparem as duas descrições.</w:t>
       </w:r>
     </w:p>
     <w:p>
@@ -2181,58 +2408,41 @@
           <w:sz w:val="22"/>
           <w:szCs w:val="22"/>
         </w:rPr>
-        <w:t xml:space="preserve">Dividam a turma em 3 grupos: "grupo subtotal" (soma preços de fichas de produtos), "grupo frete" (calcula o frete a partir de um peso sorteado) e "grupo desconto" (aplica desconto se houver um cupom sorteado).</w:t>
-      </w:r>
-    </w:p>
-    <w:p>
-      <w:pPr>
-        <w:pStyle w:val="ListParagraph"/>
-        <w:numPr>
-          <w:ilvl w:val="0"/>
-          <w:numId w:val="2"/>
-        </w:numPr>
-        <w:spacing w:after="80"/>
-      </w:pPr>
-      <w:r>
-        <w:rPr>
-          <w:sz w:val="22"/>
-          <w:szCs w:val="22"/>
-        </w:rPr>
-        <w:t xml:space="preserve">Cada grupo resolve sua parte num cartaz separado.</w:t>
-      </w:r>
-    </w:p>
-    <w:p>
-      <w:pPr>
-        <w:pStyle w:val="ListParagraph"/>
-        <w:numPr>
-          <w:ilvl w:val="0"/>
-          <w:numId w:val="2"/>
-        </w:numPr>
-        <w:spacing w:after="80"/>
-      </w:pPr>
-      <w:r>
-        <w:rPr>
-          <w:sz w:val="22"/>
-          <w:szCs w:val="22"/>
-        </w:rPr>
-        <w:t xml:space="preserve">Um quarto grupo ("montador") combina os três cartazes para chegar ao preço final.</w:t>
-      </w:r>
-    </w:p>
-    <w:p>
-      <w:pPr>
-        <w:pStyle w:val="ListParagraph"/>
-        <w:numPr>
-          <w:ilvl w:val="0"/>
-          <w:numId w:val="2"/>
-        </w:numPr>
-        <w:spacing w:after="80"/>
-      </w:pPr>
-      <w:r>
-        <w:rPr>
-          <w:sz w:val="22"/>
-          <w:szCs w:val="22"/>
-        </w:rPr>
-        <w:t xml:space="preserve">Discutam: o que teria sido mais difícil se um único grupo tivesse que fazer tudo de uma vez?</w:t>
+        <w:t xml:space="preserve">Façam um cartaz central "Veículo" (conceito genérico) com setas apontando para dois cartazes "filhos": "Carro" e "Bicicleta".</w:t>
+      </w:r>
+    </w:p>
+    <w:p>
+      <w:pPr>
+        <w:pStyle w:val="ListParagraph"/>
+        <w:numPr>
+          <w:ilvl w:val="0"/>
+          <w:numId w:val="2"/>
+        </w:numPr>
+        <w:spacing w:after="80"/>
+      </w:pPr>
+      <w:r>
+        <w:rPr>
+          <w:sz w:val="22"/>
+          <w:szCs w:val="22"/>
+        </w:rPr>
+        <w:t xml:space="preserve">Em cada cartaz-filho, listem os atributos próprios (Carro: 4 rodas, combustível; Bicicleta: 2 rodas) — e uma linha comum "herdada" do cartaz genérico (todo veículo tem rodas).</w:t>
+      </w:r>
+    </w:p>
+    <w:p>
+      <w:pPr>
+        <w:pStyle w:val="ListParagraph"/>
+        <w:numPr>
+          <w:ilvl w:val="0"/>
+          <w:numId w:val="2"/>
+        </w:numPr>
+        <w:spacing w:after="80"/>
+      </w:pPr>
+      <w:r>
+        <w:rPr>
+          <w:sz w:val="22"/>
+          <w:szCs w:val="22"/>
+        </w:rPr>
+        <w:t xml:space="preserve">Discutam: se quiséssemos acrescentar um terceiro veículo, como "Patinete", o que ele herdaria do cartaz genérico, e o que seria só dele?</w:t>
       </w:r>
     </w:p>
     <w:p>
@@ -2264,7 +2474,7 @@
           <w:sz w:val="20"/>
           <w:szCs w:val="20"/>
         </w:rPr>
-        <w:t xml:space="preserve">decomposição como ferramenta de construção e de depuração.</w:t>
+        <w:t xml:space="preserve">abstração (destacar o essencial) e especialização (hierarquia do genérico ao específico).</w:t>
       </w:r>
     </w:p>
     <w:p>
@@ -2297,7 +2507,7 @@
           <w:sz w:val="34"/>
           <w:szCs w:val="34"/>
         </w:rPr>
-        <w:t xml:space="preserve">Generalização — de um caso fixo a uma regra geral</w:t>
+        <w:t xml:space="preserve">Tipos Próprios e Ações por Categoria</w:t>
       </w:r>
     </w:p>
     <w:p>
@@ -2312,7 +2522,7 @@
           <w:sz w:val="20"/>
           <w:szCs w:val="20"/>
         </w:rPr>
-        <w:t xml:space="preserve">Aula 7 · Generalização · Pensamento Computacional</w:t>
+        <w:t xml:space="preserve">Aula 11-12 · Definindo Novos Tipos e Ações Ligadas a Categorias · Pensamento Computacional</w:t>
       </w:r>
     </w:p>
     <w:p>
@@ -2344,7 +2554,7 @@
           <w:sz w:val="22"/>
           <w:szCs w:val="22"/>
         </w:rPr>
-        <w:t xml:space="preserve">Transformar um cálculo fixo numa função com parâmetro, testando também um caso extremo — como praticado na Aula 7, ao generalizar sem perder o sentido do modelo.</w:t>
+        <w:t xml:space="preserve">Criar tipos próprios (um fixo, um mutável) e, em seguida, definir uma ação diferente para cada categoria de tipo — unindo a criação de tipos (Aula 11) com o reconhecimento de que a categoria define a ação certa (Aula 12).</w:t>
       </w:r>
     </w:p>
     <w:p>
@@ -2376,7 +2586,7 @@
           <w:sz w:val="22"/>
           <w:szCs w:val="22"/>
         </w:rPr>
-        <w:t xml:space="preserve">Partam de um cálculo fixo e generalizem para uma função parametrizada.</w:t>
+        <w:t xml:space="preserve">Criem um tipo fixo e um mutável, e uma função processar com um comportamento específico para cada um.</w:t>
       </w:r>
     </w:p>
     <w:tbl>
@@ -2416,7 +2626,63 @@
                 <w:sz w:val="20"/>
                 <w:szCs w:val="20"/>
               </w:rPr>
-              <w:t xml:space="preserve">area_quadrado_5 = 5 * 5   # caso fixo</w:t>
+              <w:t xml:space="preserve">struct Aluno</w:t>
+            </w:r>
+          </w:p>
+          <w:p>
+            <w:pPr>
+              <w:spacing w:after="0"/>
+            </w:pPr>
+            <w:r>
+              <w:rPr>
+                <w:rFonts w:ascii="Courier New" w:cs="Courier New" w:eastAsia="Courier New" w:hAnsi="Courier New"/>
+                <w:color w:val="20303F"/>
+                <w:sz w:val="20"/>
+                <w:szCs w:val="20"/>
+              </w:rPr>
+              <w:t xml:space="preserve">    nome::String</w:t>
+            </w:r>
+          </w:p>
+          <w:p>
+            <w:pPr>
+              <w:spacing w:after="0"/>
+            </w:pPr>
+            <w:r>
+              <w:rPr>
+                <w:rFonts w:ascii="Courier New" w:cs="Courier New" w:eastAsia="Courier New" w:hAnsi="Courier New"/>
+                <w:color w:val="20303F"/>
+                <w:sz w:val="20"/>
+                <w:szCs w:val="20"/>
+              </w:rPr>
+              <w:t xml:space="preserve">    matricula::Int</w:t>
+            </w:r>
+          </w:p>
+          <w:p>
+            <w:pPr>
+              <w:spacing w:after="0"/>
+            </w:pPr>
+            <w:r>
+              <w:rPr>
+                <w:rFonts w:ascii="Courier New" w:cs="Courier New" w:eastAsia="Courier New" w:hAnsi="Courier New"/>
+                <w:color w:val="20303F"/>
+                <w:sz w:val="20"/>
+                <w:szCs w:val="20"/>
+              </w:rPr>
+              <w:t xml:space="preserve">    notas::Vector{Float64}</w:t>
+            </w:r>
+          </w:p>
+          <w:p>
+            <w:pPr>
+              <w:spacing w:after="0"/>
+            </w:pPr>
+            <w:r>
+              <w:rPr>
+                <w:rFonts w:ascii="Courier New" w:cs="Courier New" w:eastAsia="Courier New" w:hAnsi="Courier New"/>
+                <w:color w:val="20303F"/>
+                <w:sz w:val="20"/>
+                <w:szCs w:val="20"/>
+              </w:rPr>
+              <w:t xml:space="preserve">end</w:t>
             </w:r>
           </w:p>
           <w:p>
@@ -2444,7 +2710,49 @@
                 <w:sz w:val="20"/>
                 <w:szCs w:val="20"/>
               </w:rPr>
-              <w:t xml:space="preserve">area_quadrado(lado) = lado * lado   # generalização</w:t>
+              <w:t xml:space="preserve">mutable struct Estoque</w:t>
+            </w:r>
+          </w:p>
+          <w:p>
+            <w:pPr>
+              <w:spacing w:after="0"/>
+            </w:pPr>
+            <w:r>
+              <w:rPr>
+                <w:rFonts w:ascii="Courier New" w:cs="Courier New" w:eastAsia="Courier New" w:hAnsi="Courier New"/>
+                <w:color w:val="20303F"/>
+                <w:sz w:val="20"/>
+                <w:szCs w:val="20"/>
+              </w:rPr>
+              <w:t xml:space="preserve">    produto::String</w:t>
+            </w:r>
+          </w:p>
+          <w:p>
+            <w:pPr>
+              <w:spacing w:after="0"/>
+            </w:pPr>
+            <w:r>
+              <w:rPr>
+                <w:rFonts w:ascii="Courier New" w:cs="Courier New" w:eastAsia="Courier New" w:hAnsi="Courier New"/>
+                <w:color w:val="20303F"/>
+                <w:sz w:val="20"/>
+                <w:szCs w:val="20"/>
+              </w:rPr>
+              <w:t xml:space="preserve">    quantidade::Int</w:t>
+            </w:r>
+          </w:p>
+          <w:p>
+            <w:pPr>
+              <w:spacing w:after="0"/>
+            </w:pPr>
+            <w:r>
+              <w:rPr>
+                <w:rFonts w:ascii="Courier New" w:cs="Courier New" w:eastAsia="Courier New" w:hAnsi="Courier New"/>
+                <w:color w:val="20303F"/>
+                <w:sz w:val="20"/>
+                <w:szCs w:val="20"/>
+              </w:rPr>
+              <w:t xml:space="preserve">end</w:t>
             </w:r>
           </w:p>
           <w:p>
@@ -2472,21 +2780,91 @@
                 <w:sz w:val="20"/>
                 <w:szCs w:val="20"/>
               </w:rPr>
-              <w:t xml:space="preserve">casos_teste = [0, 1, 5, 10]</w:t>
-            </w:r>
-          </w:p>
-          <w:p>
-            <w:pPr>
-              <w:spacing w:after="0"/>
-            </w:pPr>
-            <w:r>
-              <w:rPr>
-                <w:rFonts w:ascii="Courier New" w:cs="Courier New" w:eastAsia="Courier New" w:hAnsi="Courier New"/>
-                <w:color w:val="20303F"/>
-                <w:sz w:val="20"/>
-                <w:szCs w:val="20"/>
-              </w:rPr>
-              <w:t xml:space="preserve">resultados = area_quadrado.(casos_teste)</w:t>
+              <w:t xml:space="preserve">processar(a::Aluno) = "Média de $(a.nome): $(sum(a.notas)/length(a.notas))"</w:t>
+            </w:r>
+          </w:p>
+          <w:p>
+            <w:pPr>
+              <w:spacing w:after="0"/>
+            </w:pPr>
+            <w:r>
+              <w:rPr>
+                <w:rFonts w:ascii="Courier New" w:cs="Courier New" w:eastAsia="Courier New" w:hAnsi="Courier New"/>
+                <w:color w:val="20303F"/>
+                <w:sz w:val="20"/>
+                <w:szCs w:val="20"/>
+              </w:rPr>
+              <w:t xml:space="preserve">processar(e::Estoque) = "Estoque de $(e.produto): $(e.quantidade) unidades"</w:t>
+            </w:r>
+          </w:p>
+          <w:p>
+            <w:pPr>
+              <w:spacing w:after="0"/>
+            </w:pPr>
+            <w:r>
+              <w:rPr>
+                <w:rFonts w:ascii="Courier New" w:cs="Courier New" w:eastAsia="Courier New" w:hAnsi="Courier New"/>
+                <w:color w:val="20303F"/>
+                <w:sz w:val="20"/>
+                <w:szCs w:val="20"/>
+              </w:rPr>
+              <w:t xml:space="preserve"> </w:t>
+            </w:r>
+          </w:p>
+          <w:p>
+            <w:pPr>
+              <w:spacing w:after="0"/>
+            </w:pPr>
+            <w:r>
+              <w:rPr>
+                <w:rFonts w:ascii="Courier New" w:cs="Courier New" w:eastAsia="Courier New" w:hAnsi="Courier New"/>
+                <w:color w:val="20303F"/>
+                <w:sz w:val="20"/>
+                <w:szCs w:val="20"/>
+              </w:rPr>
+              <w:t xml:space="preserve">itens = [Aluno("Maria", 1, [8.0, 9.0]), Estoque("Caderno", 50)]</w:t>
+            </w:r>
+          </w:p>
+          <w:p>
+            <w:pPr>
+              <w:spacing w:after="0"/>
+            </w:pPr>
+            <w:r>
+              <w:rPr>
+                <w:rFonts w:ascii="Courier New" w:cs="Courier New" w:eastAsia="Courier New" w:hAnsi="Courier New"/>
+                <w:color w:val="20303F"/>
+                <w:sz w:val="20"/>
+                <w:szCs w:val="20"/>
+              </w:rPr>
+              <w:t xml:space="preserve">for item in itens</w:t>
+            </w:r>
+          </w:p>
+          <w:p>
+            <w:pPr>
+              <w:spacing w:after="0"/>
+            </w:pPr>
+            <w:r>
+              <w:rPr>
+                <w:rFonts w:ascii="Courier New" w:cs="Courier New" w:eastAsia="Courier New" w:hAnsi="Courier New"/>
+                <w:color w:val="20303F"/>
+                <w:sz w:val="20"/>
+                <w:szCs w:val="20"/>
+              </w:rPr>
+              <w:t xml:space="preserve">    println(processar(item))</w:t>
+            </w:r>
+          </w:p>
+          <w:p>
+            <w:pPr>
+              <w:spacing w:after="0"/>
+            </w:pPr>
+            <w:r>
+              <w:rPr>
+                <w:rFonts w:ascii="Courier New" w:cs="Courier New" w:eastAsia="Courier New" w:hAnsi="Courier New"/>
+                <w:color w:val="20303F"/>
+                <w:sz w:val="20"/>
+                <w:szCs w:val="20"/>
+              </w:rPr>
+              <w:t xml:space="preserve">end</w:t>
             </w:r>
           </w:p>
         </w:tc>
@@ -2503,7 +2881,7 @@
           <w:sz w:val="22"/>
           <w:szCs w:val="22"/>
         </w:rPr>
-        <w:t xml:space="preserve">Testem o caso extremo lado = 0 e discutam: o resultado ainda faz sentido? A partir de que valor a regra deixaria de ser útil na prática?</w:t>
+        <w:t xml:space="preserve">Testem processar para os dois itens da lista e expliquem por que a ação de calcular média não faria sentido aplicada ao Estoque, e vice-versa.</w:t>
       </w:r>
     </w:p>
     <w:p>
@@ -2540,41 +2918,41 @@
           <w:sz w:val="22"/>
           <w:szCs w:val="22"/>
         </w:rPr>
-        <w:t xml:space="preserve">Criem um bloco personalizado "área do quadrado" com um parâmetro "lado".</w:t>
-      </w:r>
-    </w:p>
-    <w:p>
-      <w:pPr>
-        <w:pStyle w:val="ListParagraph"/>
-        <w:numPr>
-          <w:ilvl w:val="0"/>
-          <w:numId w:val="2"/>
-        </w:numPr>
-        <w:spacing w:after="80"/>
-      </w:pPr>
-      <w:r>
-        <w:rPr>
-          <w:sz w:val="22"/>
-          <w:szCs w:val="22"/>
-        </w:rPr>
-        <w:t xml:space="preserve">Testem com vários quadrados de tamanhos diferentes, desenhados na tela proporcionalmente ao parâmetro (usando o bloco de caneta).</w:t>
-      </w:r>
-    </w:p>
-    <w:p>
-      <w:pPr>
-        <w:pStyle w:val="ListParagraph"/>
-        <w:numPr>
-          <w:ilvl w:val="0"/>
-          <w:numId w:val="2"/>
-        </w:numPr>
-        <w:spacing w:after="80"/>
-      </w:pPr>
-      <w:r>
-        <w:rPr>
-          <w:sz w:val="22"/>
-          <w:szCs w:val="22"/>
-        </w:rPr>
-        <w:t xml:space="preserve">Testem o caso lado = 0 e observem e discutam o que acontece visualmente (nenhum quadrado aparece).</w:t>
+        <w:t xml:space="preserve">Criem um sprite "Aluno" (dados fixos: nome, matrícula, notas) e um sprite "Estoque" (quantidade alterável pelo bloco "mude quantidade por").</w:t>
+      </w:r>
+    </w:p>
+    <w:p>
+      <w:pPr>
+        <w:pStyle w:val="ListParagraph"/>
+        <w:numPr>
+          <w:ilvl w:val="0"/>
+          <w:numId w:val="2"/>
+        </w:numPr>
+        <w:spacing w:after="80"/>
+      </w:pPr>
+      <w:r>
+        <w:rPr>
+          <w:sz w:val="22"/>
+          <w:szCs w:val="22"/>
+        </w:rPr>
+        <w:t xml:space="preserve">Deem a cada sprite um bloco "processar" próprio: o do Aluno calcula a média das notas, o do Estoque mostra a quantidade atual.</w:t>
+      </w:r>
+    </w:p>
+    <w:p>
+      <w:pPr>
+        <w:pStyle w:val="ListParagraph"/>
+        <w:numPr>
+          <w:ilvl w:val="0"/>
+          <w:numId w:val="2"/>
+        </w:numPr>
+        <w:spacing w:after="80"/>
+      </w:pPr>
+      <w:r>
+        <w:rPr>
+          <w:sz w:val="22"/>
+          <w:szCs w:val="22"/>
+        </w:rPr>
+        <w:t xml:space="preserve">Executem clicando em cada sprite e comparem as duas ações.</w:t>
       </w:r>
     </w:p>
     <w:p>
@@ -2611,58 +2989,41 @@
           <w:sz w:val="22"/>
           <w:szCs w:val="22"/>
         </w:rPr>
-        <w:t xml:space="preserve">Preparem quadrados de papel quadriculado de tamanhos fixos (3×3, 5×5, 7×7 quadrículas).</w:t>
-      </w:r>
-    </w:p>
-    <w:p>
-      <w:pPr>
-        <w:pStyle w:val="ListParagraph"/>
-        <w:numPr>
-          <w:ilvl w:val="0"/>
-          <w:numId w:val="2"/>
-        </w:numPr>
-        <w:spacing w:after="80"/>
-      </w:pPr>
-      <w:r>
-        <w:rPr>
-          <w:sz w:val="22"/>
-          <w:szCs w:val="22"/>
-        </w:rPr>
-        <w:t xml:space="preserve">Os alunos primeiro contam manualmente os quadradinhos de cada um (contagem = área).</w:t>
-      </w:r>
-    </w:p>
-    <w:p>
-      <w:pPr>
-        <w:pStyle w:val="ListParagraph"/>
-        <w:numPr>
-          <w:ilvl w:val="0"/>
-          <w:numId w:val="2"/>
-        </w:numPr>
-        <w:spacing w:after="80"/>
-      </w:pPr>
-      <w:r>
-        <w:rPr>
-          <w:sz w:val="22"/>
-          <w:szCs w:val="22"/>
-        </w:rPr>
-        <w:t xml:space="preserve">Depois, formulam uma regra geral (fórmula) e a testam prevendo a área de um quadrado maior, sem contar quadradinho por quadradinho.</w:t>
-      </w:r>
-    </w:p>
-    <w:p>
-      <w:pPr>
-        <w:pStyle w:val="ListParagraph"/>
-        <w:numPr>
-          <w:ilvl w:val="0"/>
-          <w:numId w:val="2"/>
-        </w:numPr>
-        <w:spacing w:after="80"/>
-      </w:pPr>
-      <w:r>
-        <w:rPr>
-          <w:sz w:val="22"/>
-          <w:szCs w:val="22"/>
-        </w:rPr>
-        <w:t xml:space="preserve">Discutam oralmente o caso-limite: o que aconteceria com um quadrado de lado 0? E de lado negativo?</w:t>
+        <w:t xml:space="preserve">Preencham uma "Ficha de Aluno" a caneta (não pode ser apagada — tipo fixo) e uma "Ficha de Estoque" a lápis (quantidade apagável e reescrevível — tipo mutável).</w:t>
+      </w:r>
+    </w:p>
+    <w:p>
+      <w:pPr>
+        <w:pStyle w:val="ListParagraph"/>
+        <w:numPr>
+          <w:ilvl w:val="0"/>
+          <w:numId w:val="2"/>
+        </w:numPr>
+        <w:spacing w:after="80"/>
+      </w:pPr>
+      <w:r>
+        <w:rPr>
+          <w:sz w:val="22"/>
+          <w:szCs w:val="22"/>
+        </w:rPr>
+        <w:t xml:space="preserve">Ao lado de cada ficha, escrevam a ação própria daquela categoria (aluno: calcular média das notas; estoque: contar unidades) e peçam que o grupo execute cada ação manualmente.</w:t>
+      </w:r>
+    </w:p>
+    <w:p>
+      <w:pPr>
+        <w:pStyle w:val="ListParagraph"/>
+        <w:numPr>
+          <w:ilvl w:val="0"/>
+          <w:numId w:val="2"/>
+        </w:numPr>
+        <w:spacing w:after="80"/>
+      </w:pPr>
+      <w:r>
+        <w:rPr>
+          <w:sz w:val="22"/>
+          <w:szCs w:val="22"/>
+        </w:rPr>
+        <w:t xml:space="preserve">Discutam: por que calcular média faz sentido para o aluno mas não para o estoque, e por que atualizar quantidade faz sentido para o estoque mas não para o aluno?</w:t>
       </w:r>
     </w:p>
     <w:p>
@@ -2694,7 +3055,7 @@
           <w:sz w:val="20"/>
           <w:szCs w:val="20"/>
         </w:rPr>
-        <w:t xml:space="preserve">generalização e reflexão sobre os limites do modelo.</w:t>
+        <w:t xml:space="preserve">criação de tipos próprios, mutabilidade, e reconhecimento de que a categoria define a ação apropriada.</w:t>
       </w:r>
     </w:p>
     <w:p>
@@ -2727,7 +3088,7 @@
           <w:sz w:val="34"/>
           <w:szCs w:val="34"/>
         </w:rPr>
-        <w:t xml:space="preserve">Transformação — um pipeline em cadeia</w:t>
+        <w:t xml:space="preserve">Complexidade de Algoritmos — contando passos, não segundos</w:t>
       </w:r>
     </w:p>
     <w:p>
@@ -2742,7 +3103,7 @@
           <w:sz w:val="20"/>
           <w:szCs w:val="20"/>
         </w:rPr>
-        <w:t xml:space="preserve">Aula 8 · Transformação · Pensamento Computacional</w:t>
+        <w:t xml:space="preserve">Aula 14 · Complexidade de Algoritmos · Pensamento Computacional</w:t>
       </w:r>
     </w:p>
     <w:p>
@@ -2774,7 +3135,7 @@
           <w:sz w:val="22"/>
           <w:szCs w:val="22"/>
         </w:rPr>
-        <w:t xml:space="preserve">Construir um pipeline de transformações em sequência sobre um texto, comparando o dado antes e depois de cada etapa — como praticado na Aula 8.</w:t>
+        <w:t xml:space="preserve">Construir a função de custo T(n) a partir da contagem de passos, comparando o crescimento de um laço simples (linear) com o de um laço duplo (quadrático) — como praticado na Aula 14.</w:t>
       </w:r>
     </w:p>
     <w:p>
@@ -2806,7 +3167,7 @@
           <w:sz w:val="22"/>
           <w:szCs w:val="22"/>
         </w:rPr>
-        <w:t xml:space="preserve">Construam um pipeline de pelo menos três transformações sobre um texto.</w:t>
+        <w:t xml:space="preserve">Contem os passos de duas funções que processam a mesma lista de tamanhos diferentes.</w:t>
       </w:r>
     </w:p>
     <w:tbl>
@@ -2846,7 +3207,91 @@
                 <w:sz w:val="20"/>
                 <w:szCs w:val="20"/>
               </w:rPr>
-              <w:t xml:space="preserve">texto = "o gato e o cachorro e o gato"</w:t>
+              <w:t xml:space="preserve">function soma_simples(v)</w:t>
+            </w:r>
+          </w:p>
+          <w:p>
+            <w:pPr>
+              <w:spacing w:after="0"/>
+            </w:pPr>
+            <w:r>
+              <w:rPr>
+                <w:rFonts w:ascii="Courier New" w:cs="Courier New" w:eastAsia="Courier New" w:hAnsi="Courier New"/>
+                <w:color w:val="20303F"/>
+                <w:sz w:val="20"/>
+                <w:szCs w:val="20"/>
+              </w:rPr>
+              <w:t xml:space="preserve">    s = 0</w:t>
+            </w:r>
+          </w:p>
+          <w:p>
+            <w:pPr>
+              <w:spacing w:after="0"/>
+            </w:pPr>
+            <w:r>
+              <w:rPr>
+                <w:rFonts w:ascii="Courier New" w:cs="Courier New" w:eastAsia="Courier New" w:hAnsi="Courier New"/>
+                <w:color w:val="20303F"/>
+                <w:sz w:val="20"/>
+                <w:szCs w:val="20"/>
+              </w:rPr>
+              <w:t xml:space="preserve">    for x in v</w:t>
+            </w:r>
+          </w:p>
+          <w:p>
+            <w:pPr>
+              <w:spacing w:after="0"/>
+            </w:pPr>
+            <w:r>
+              <w:rPr>
+                <w:rFonts w:ascii="Courier New" w:cs="Courier New" w:eastAsia="Courier New" w:hAnsi="Courier New"/>
+                <w:color w:val="20303F"/>
+                <w:sz w:val="20"/>
+                <w:szCs w:val="20"/>
+              </w:rPr>
+              <w:t xml:space="preserve">        s += x        # 1 passo por elemento -&gt; T(n) = n</w:t>
+            </w:r>
+          </w:p>
+          <w:p>
+            <w:pPr>
+              <w:spacing w:after="0"/>
+            </w:pPr>
+            <w:r>
+              <w:rPr>
+                <w:rFonts w:ascii="Courier New" w:cs="Courier New" w:eastAsia="Courier New" w:hAnsi="Courier New"/>
+                <w:color w:val="20303F"/>
+                <w:sz w:val="20"/>
+                <w:szCs w:val="20"/>
+              </w:rPr>
+              <w:t xml:space="preserve">    end</w:t>
+            </w:r>
+          </w:p>
+          <w:p>
+            <w:pPr>
+              <w:spacing w:after="0"/>
+            </w:pPr>
+            <w:r>
+              <w:rPr>
+                <w:rFonts w:ascii="Courier New" w:cs="Courier New" w:eastAsia="Courier New" w:hAnsi="Courier New"/>
+                <w:color w:val="20303F"/>
+                <w:sz w:val="20"/>
+                <w:szCs w:val="20"/>
+              </w:rPr>
+              <w:t xml:space="preserve">    return s</w:t>
+            </w:r>
+          </w:p>
+          <w:p>
+            <w:pPr>
+              <w:spacing w:after="0"/>
+            </w:pPr>
+            <w:r>
+              <w:rPr>
+                <w:rFonts w:ascii="Courier New" w:cs="Courier New" w:eastAsia="Courier New" w:hAnsi="Courier New"/>
+                <w:color w:val="20303F"/>
+                <w:sz w:val="20"/>
+                <w:szCs w:val="20"/>
+              </w:rPr>
+              <w:t xml:space="preserve">end</w:t>
             </w:r>
           </w:p>
           <w:p>
@@ -2874,63 +3319,133 @@
                 <w:sz w:val="20"/>
                 <w:szCs w:val="20"/>
               </w:rPr>
-              <w:t xml:space="preserve">palavras = split(texto, " ")       # texto → palavras</w:t>
-            </w:r>
-          </w:p>
-          <w:p>
-            <w:pPr>
-              <w:spacing w:after="0"/>
-            </w:pPr>
-            <w:r>
-              <w:rPr>
-                <w:rFonts w:ascii="Courier New" w:cs="Courier New" w:eastAsia="Courier New" w:hAnsi="Courier New"/>
-                <w:color w:val="20303F"/>
-                <w:sz w:val="20"/>
-                <w:szCs w:val="20"/>
-              </w:rPr>
-              <w:t xml:space="preserve"> </w:t>
-            </w:r>
-          </w:p>
-          <w:p>
-            <w:pPr>
-              <w:spacing w:after="0"/>
-            </w:pPr>
-            <w:r>
-              <w:rPr>
-                <w:rFonts w:ascii="Courier New" w:cs="Courier New" w:eastAsia="Courier New" w:hAnsi="Courier New"/>
-                <w:color w:val="20303F"/>
-                <w:sz w:val="20"/>
-                <w:szCs w:val="20"/>
-              </w:rPr>
-              <w:t xml:space="preserve">contagem = Dict{String,Int}()</w:t>
-            </w:r>
-          </w:p>
-          <w:p>
-            <w:pPr>
-              <w:spacing w:after="0"/>
-            </w:pPr>
-            <w:r>
-              <w:rPr>
-                <w:rFonts w:ascii="Courier New" w:cs="Courier New" w:eastAsia="Courier New" w:hAnsi="Courier New"/>
-                <w:color w:val="20303F"/>
-                <w:sz w:val="20"/>
-                <w:szCs w:val="20"/>
-              </w:rPr>
-              <w:t xml:space="preserve">for p in palavras                  # palavras → contagem</w:t>
-            </w:r>
-          </w:p>
-          <w:p>
-            <w:pPr>
-              <w:spacing w:after="0"/>
-            </w:pPr>
-            <w:r>
-              <w:rPr>
-                <w:rFonts w:ascii="Courier New" w:cs="Courier New" w:eastAsia="Courier New" w:hAnsi="Courier New"/>
-                <w:color w:val="20303F"/>
-                <w:sz w:val="20"/>
-                <w:szCs w:val="20"/>
-              </w:rPr>
-              <w:t xml:space="preserve">    contagem[p] = get(contagem, p, 0) + 1</w:t>
+              <w:t xml:space="preserve">function pares_iguais(v)</w:t>
+            </w:r>
+          </w:p>
+          <w:p>
+            <w:pPr>
+              <w:spacing w:after="0"/>
+            </w:pPr>
+            <w:r>
+              <w:rPr>
+                <w:rFonts w:ascii="Courier New" w:cs="Courier New" w:eastAsia="Courier New" w:hAnsi="Courier New"/>
+                <w:color w:val="20303F"/>
+                <w:sz w:val="20"/>
+                <w:szCs w:val="20"/>
+              </w:rPr>
+              <w:t xml:space="preserve">    contador = 0</w:t>
+            </w:r>
+          </w:p>
+          <w:p>
+            <w:pPr>
+              <w:spacing w:after="0"/>
+            </w:pPr>
+            <w:r>
+              <w:rPr>
+                <w:rFonts w:ascii="Courier New" w:cs="Courier New" w:eastAsia="Courier New" w:hAnsi="Courier New"/>
+                <w:color w:val="20303F"/>
+                <w:sz w:val="20"/>
+                <w:szCs w:val="20"/>
+              </w:rPr>
+              <w:t xml:space="preserve">    for i in 1:length(v)</w:t>
+            </w:r>
+          </w:p>
+          <w:p>
+            <w:pPr>
+              <w:spacing w:after="0"/>
+            </w:pPr>
+            <w:r>
+              <w:rPr>
+                <w:rFonts w:ascii="Courier New" w:cs="Courier New" w:eastAsia="Courier New" w:hAnsi="Courier New"/>
+                <w:color w:val="20303F"/>
+                <w:sz w:val="20"/>
+                <w:szCs w:val="20"/>
+              </w:rPr>
+              <w:t xml:space="preserve">        for j in 1:length(v)</w:t>
+            </w:r>
+          </w:p>
+          <w:p>
+            <w:pPr>
+              <w:spacing w:after="0"/>
+            </w:pPr>
+            <w:r>
+              <w:rPr>
+                <w:rFonts w:ascii="Courier New" w:cs="Courier New" w:eastAsia="Courier New" w:hAnsi="Courier New"/>
+                <w:color w:val="20303F"/>
+                <w:sz w:val="20"/>
+                <w:szCs w:val="20"/>
+              </w:rPr>
+              <w:t xml:space="preserve">            if v[i] == v[j]</w:t>
+            </w:r>
+          </w:p>
+          <w:p>
+            <w:pPr>
+              <w:spacing w:after="0"/>
+            </w:pPr>
+            <w:r>
+              <w:rPr>
+                <w:rFonts w:ascii="Courier New" w:cs="Courier New" w:eastAsia="Courier New" w:hAnsi="Courier New"/>
+                <w:color w:val="20303F"/>
+                <w:sz w:val="20"/>
+                <w:szCs w:val="20"/>
+              </w:rPr>
+              <w:t xml:space="preserve">                contador += 1   # 1 passo por par -&gt; T(n) = n²</w:t>
+            </w:r>
+          </w:p>
+          <w:p>
+            <w:pPr>
+              <w:spacing w:after="0"/>
+            </w:pPr>
+            <w:r>
+              <w:rPr>
+                <w:rFonts w:ascii="Courier New" w:cs="Courier New" w:eastAsia="Courier New" w:hAnsi="Courier New"/>
+                <w:color w:val="20303F"/>
+                <w:sz w:val="20"/>
+                <w:szCs w:val="20"/>
+              </w:rPr>
+              <w:t xml:space="preserve">            end</w:t>
+            </w:r>
+          </w:p>
+          <w:p>
+            <w:pPr>
+              <w:spacing w:after="0"/>
+            </w:pPr>
+            <w:r>
+              <w:rPr>
+                <w:rFonts w:ascii="Courier New" w:cs="Courier New" w:eastAsia="Courier New" w:hAnsi="Courier New"/>
+                <w:color w:val="20303F"/>
+                <w:sz w:val="20"/>
+                <w:szCs w:val="20"/>
+              </w:rPr>
+              <w:t xml:space="preserve">        end</w:t>
+            </w:r>
+          </w:p>
+          <w:p>
+            <w:pPr>
+              <w:spacing w:after="0"/>
+            </w:pPr>
+            <w:r>
+              <w:rPr>
+                <w:rFonts w:ascii="Courier New" w:cs="Courier New" w:eastAsia="Courier New" w:hAnsi="Courier New"/>
+                <w:color w:val="20303F"/>
+                <w:sz w:val="20"/>
+                <w:szCs w:val="20"/>
+              </w:rPr>
+              <w:t xml:space="preserve">    end</w:t>
+            </w:r>
+          </w:p>
+          <w:p>
+            <w:pPr>
+              <w:spacing w:after="0"/>
+            </w:pPr>
+            <w:r>
+              <w:rPr>
+                <w:rFonts w:ascii="Courier New" w:cs="Courier New" w:eastAsia="Courier New" w:hAnsi="Courier New"/>
+                <w:color w:val="20303F"/>
+                <w:sz w:val="20"/>
+                <w:szCs w:val="20"/>
+              </w:rPr>
+              <w:t xml:space="preserve">    return contador</w:t>
             </w:r>
           </w:p>
           <w:p>
@@ -2961,7 +3476,7 @@
           <w:sz w:val="22"/>
           <w:szCs w:val="22"/>
         </w:rPr>
-        <w:t xml:space="preserve">Encontrem a palavra mais frequente a partir de 'contagem' (uma transformação a mais) e comparem o texto original com o resultado final: o que se perdeu no caminho (por exemplo, a ordem das palavras)?</w:t>
+        <w:t xml:space="preserve">Contem manualmente quantas vezes a linha marcada roda para n = 4, depois testem com n = 8: a soma_simples dobrou de trabalho, ou a pares_iguais quadruplicou? Registrem os dois valores.</w:t>
       </w:r>
     </w:p>
     <w:p>
@@ -2998,58 +3513,41 @@
           <w:sz w:val="22"/>
           <w:szCs w:val="22"/>
         </w:rPr>
-        <w:t xml:space="preserve">Usem o bloco "separar por" numa string de texto para gerar uma lista de palavras.</w:t>
-      </w:r>
-    </w:p>
-    <w:p>
-      <w:pPr>
-        <w:pStyle w:val="ListParagraph"/>
-        <w:numPr>
-          <w:ilvl w:val="0"/>
-          <w:numId w:val="2"/>
-        </w:numPr>
-        <w:spacing w:after="80"/>
-      </w:pPr>
-      <w:r>
-        <w:rPr>
-          <w:sz w:val="22"/>
-          <w:szCs w:val="22"/>
-        </w:rPr>
-        <w:t xml:space="preserve">Percorram a lista com "para cada item", contando as ocorrências em variáveis.</w:t>
-      </w:r>
-    </w:p>
-    <w:p>
-      <w:pPr>
-        <w:pStyle w:val="ListParagraph"/>
-        <w:numPr>
-          <w:ilvl w:val="0"/>
-          <w:numId w:val="2"/>
-        </w:numPr>
-        <w:spacing w:after="80"/>
-      </w:pPr>
-      <w:r>
-        <w:rPr>
-          <w:sz w:val="22"/>
-          <w:szCs w:val="22"/>
-        </w:rPr>
-        <w:t xml:space="preserve">Ao final, usem "diga" para mostrar a palavra mais frequente encontrada.</w:t>
-      </w:r>
-    </w:p>
-    <w:p>
-      <w:pPr>
-        <w:pStyle w:val="ListParagraph"/>
-        <w:numPr>
-          <w:ilvl w:val="0"/>
-          <w:numId w:val="2"/>
-        </w:numPr>
-        <w:spacing w:after="80"/>
-      </w:pPr>
-      <w:r>
-        <w:rPr>
-          <w:sz w:val="22"/>
-          <w:szCs w:val="22"/>
-        </w:rPr>
-        <w:t xml:space="preserve">Anotem, entre cada bloco do script (em post-its ao lado), qual era o dado "antes" e "depois" daquela etapa.</w:t>
+        <w:t xml:space="preserve">Montem um script com um laço "repita (tamanho da lista) vezes" que soma os itens de uma lista, usando uma variável "contador de passos" que aumenta 1 a cada repetição.</w:t>
+      </w:r>
+    </w:p>
+    <w:p>
+      <w:pPr>
+        <w:pStyle w:val="ListParagraph"/>
+        <w:numPr>
+          <w:ilvl w:val="0"/>
+          <w:numId w:val="2"/>
+        </w:numPr>
+        <w:spacing w:after="80"/>
+      </w:pPr>
+      <w:r>
+        <w:rPr>
+          <w:sz w:val="22"/>
+          <w:szCs w:val="22"/>
+        </w:rPr>
+        <w:t xml:space="preserve">Montem um segundo script com dois laços aninhados ("repita" dentro de "repita") sobre a mesma lista, também contando os passos.</w:t>
+      </w:r>
+    </w:p>
+    <w:p>
+      <w:pPr>
+        <w:pStyle w:val="ListParagraph"/>
+        <w:numPr>
+          <w:ilvl w:val="0"/>
+          <w:numId w:val="2"/>
+        </w:numPr>
+        <w:spacing w:after="80"/>
+      </w:pPr>
+      <w:r>
+        <w:rPr>
+          <w:sz w:val="22"/>
+          <w:szCs w:val="22"/>
+        </w:rPr>
+        <w:t xml:space="preserve">Testem os dois scripts com listas de tamanho 4 e depois 8, anotando o valor final do contador de passos em cada caso, e comparem o crescimento.</w:t>
       </w:r>
     </w:p>
     <w:p>
@@ -3086,75 +3584,58 @@
           <w:sz w:val="22"/>
           <w:szCs w:val="22"/>
         </w:rPr>
-        <w:t xml:space="preserve">Escrevam uma frase em tiras de papel, uma palavra por tira, e misturem as tiras.</w:t>
-      </w:r>
-    </w:p>
-    <w:p>
-      <w:pPr>
-        <w:pStyle w:val="ListParagraph"/>
-        <w:numPr>
-          <w:ilvl w:val="0"/>
-          <w:numId w:val="2"/>
-        </w:numPr>
-        <w:spacing w:after="80"/>
-      </w:pPr>
-      <w:r>
-        <w:rPr>
-          <w:sz w:val="22"/>
-          <w:szCs w:val="22"/>
-        </w:rPr>
-        <w:t xml:space="preserve">Estação 1: separar as tiras (transformação "texto → palavras").</w:t>
-      </w:r>
-    </w:p>
-    <w:p>
-      <w:pPr>
-        <w:pStyle w:val="ListParagraph"/>
-        <w:numPr>
-          <w:ilvl w:val="0"/>
-          <w:numId w:val="2"/>
-        </w:numPr>
-        <w:spacing w:after="80"/>
-      </w:pPr>
-      <w:r>
-        <w:rPr>
-          <w:sz w:val="22"/>
-          <w:szCs w:val="22"/>
-        </w:rPr>
-        <w:t xml:space="preserve">Estação 2: agrupar tiras iguais em pilhas (transformação "palavras → contagem").</w:t>
-      </w:r>
-    </w:p>
-    <w:p>
-      <w:pPr>
-        <w:pStyle w:val="ListParagraph"/>
-        <w:numPr>
-          <w:ilvl w:val="0"/>
-          <w:numId w:val="2"/>
-        </w:numPr>
-        <w:spacing w:after="80"/>
-      </w:pPr>
-      <w:r>
-        <w:rPr>
-          <w:sz w:val="22"/>
-          <w:szCs w:val="22"/>
-        </w:rPr>
-        <w:t xml:space="preserve">Estação 3: identificar a pilha mais alta (transformação "contagem → palavra mais frequente").</w:t>
-      </w:r>
-    </w:p>
-    <w:p>
-      <w:pPr>
-        <w:pStyle w:val="ListParagraph"/>
-        <w:numPr>
-          <w:ilvl w:val="0"/>
-          <w:numId w:val="2"/>
-        </w:numPr>
-        <w:spacing w:after="80"/>
-      </w:pPr>
-      <w:r>
-        <w:rPr>
-          <w:sz w:val="22"/>
-          <w:szCs w:val="22"/>
-        </w:rPr>
-        <w:t xml:space="preserve">Discutam: o que se perdeu de informação a cada etapa do pipeline (por exemplo, a ordem original das palavras)?</w:t>
+        <w:t xml:space="preserve">Organizem uma fileira de 4 fichas numeradas (representando os elementos de um vetor).</w:t>
+      </w:r>
+    </w:p>
+    <w:p>
+      <w:pPr>
+        <w:pStyle w:val="ListParagraph"/>
+        <w:numPr>
+          <w:ilvl w:val="0"/>
+          <w:numId w:val="2"/>
+        </w:numPr>
+        <w:spacing w:after="80"/>
+      </w:pPr>
+      <w:r>
+        <w:rPr>
+          <w:sz w:val="22"/>
+          <w:szCs w:val="22"/>
+        </w:rPr>
+        <w:t xml:space="preserve">Atividade linear: um aluno toca em cada ficha uma única vez, em fileira, contando os toques em voz alta (T(n) = n).</w:t>
+      </w:r>
+    </w:p>
+    <w:p>
+      <w:pPr>
+        <w:pStyle w:val="ListParagraph"/>
+        <w:numPr>
+          <w:ilvl w:val="0"/>
+          <w:numId w:val="2"/>
+        </w:numPr>
+        <w:spacing w:after="80"/>
+      </w:pPr>
+      <w:r>
+        <w:rPr>
+          <w:sz w:val="22"/>
+          <w:szCs w:val="22"/>
+        </w:rPr>
+        <w:t xml:space="preserve">Atividade quadrática: para cada ficha tocada, o aluno percorre a fileira inteira de novo tocando todas as outras fichas (simulando o laço duplo), contando o total de toques (T(n) = n²).</w:t>
+      </w:r>
+    </w:p>
+    <w:p>
+      <w:pPr>
+        <w:pStyle w:val="ListParagraph"/>
+        <w:numPr>
+          <w:ilvl w:val="0"/>
+          <w:numId w:val="2"/>
+        </w:numPr>
+        <w:spacing w:after="80"/>
+      </w:pPr>
+      <w:r>
+        <w:rPr>
+          <w:sz w:val="22"/>
+          <w:szCs w:val="22"/>
+        </w:rPr>
+        <w:t xml:space="preserve">Repitam as duas atividades com 8 fichas e comparem: quantas vezes o total de toques aumentou em cada atividade quando dobramos a quantidade de fichas?</w:t>
       </w:r>
     </w:p>
     <w:p>
@@ -3186,7 +3667,7 @@
           <w:sz w:val="20"/>
           <w:szCs w:val="20"/>
         </w:rPr>
-        <w:t xml:space="preserve">transformação e transnumeração.</w:t>
+        <w:t xml:space="preserve">construir a função de custo T(n) e diferenciar crescimento linear de quadrático.</w:t>
       </w:r>
     </w:p>
     <w:sectPr>

</xml_diff>